<commit_message>
fix: 列表并段与 front matter 解析
列表并段：标准 Markdown 要求列表前有空行，否则「常见搭配：」后面紧跟的
- xxx 会被并进同一段，渲染成一行连字符。references/template.md 教的正是这种
紧跟着写的形态，所以每份讲义都中招——examples 里 27 处，全落在搭配家族、
词族、辨析这些本该分行的清单上。pandoc 开 lists_without_preceding_blankline
扩展纠正，讲义源文不用改。同一根因还波及封面的三行副信息（连续行并成一段），
examples 的封面改成空行分隔。

front matter：read_fm() 原来用 sed -n '2,10p' 硬编码行号窗口，字段排在第 10 行
之后、或值带引号都取不到，然后静默回落到文件名推导。改成 awk 读到第二个 ---
为止，不限行数，顺手剥掉包裹的引号。

另加 soffice 之后的 PDF 存在性检查。

examples 产物重新生成：24 页 → 25 页，差异来自列表展开（列表缩进 111 → 175 处）。
</commit_message>
<xml_diff>
--- a/examples/选必二_Unit1_John Snow_精读讲义.docx
+++ b/examples/选必二_Unit1_John Snow_精读讲义.docx
@@ -152,6 +152,14 @@
         </w:rPr>
         <w:t xml:space="preserve">单元主题：科学与科学家 · 提问的头脑 · 证据与方法</w:t>
       </w:r>
+    </w:p>
+    <w:p>
+      <w:pPr>
+        <w:pStyle w:val="BodyText"/>
+        <w:widowControl/>
+        <w:spacing w:before="40" w:after="0"/>
+        <w:jc w:val="center"/>
+      </w:pPr>
       <w:r>
         <w:rPr>
           <w:rFonts w:ascii="Calibri" w:hAnsi="Calibri" w:eastAsia="Microsoft YaHei" w:cs="Calibri"/>
@@ -159,26 +167,16 @@
           <w:sz w:val="21"/>
           <w:szCs w:val="21"/>
         </w:rPr>
-        <w:t xml:space="preserve"> </w:t>
-      </w:r>
-      <w:r>
-        <w:rPr>
-          <w:rFonts w:ascii="Calibri" w:hAnsi="Calibri" w:eastAsia="Microsoft YaHei" w:cs="Calibri"/>
-          <w:color w:val="64748B"/>
-          <w:sz w:val="21"/>
-          <w:szCs w:val="21"/>
-        </w:rPr>
         <w:t xml:space="preserve">阅读策略：Ask questions｜语法项：Predicative clauses（表语从句）</w:t>
       </w:r>
-      <w:r>
-        <w:rPr>
-          <w:rFonts w:ascii="Calibri" w:hAnsi="Calibri" w:eastAsia="Microsoft YaHei" w:cs="Calibri"/>
-          <w:color w:val="64748B"/>
-          <w:sz w:val="21"/>
-          <w:szCs w:val="21"/>
-        </w:rPr>
-        <w:t xml:space="preserve"> </w:t>
-      </w:r>
+    </w:p>
+    <w:p>
+      <w:pPr>
+        <w:pStyle w:val="BodyText"/>
+        <w:widowControl/>
+        <w:spacing w:before="40" w:after="0"/>
+        <w:jc w:val="center"/>
+      </w:pPr>
       <w:r>
         <w:rPr>
           <w:rFonts w:ascii="Calibri" w:hAnsi="Calibri" w:eastAsia="Microsoft YaHei" w:cs="Calibri"/>
@@ -1591,302 +1589,6 @@
       <w:r>
         <w:t xml:space="preserve">常见搭配：</w:t>
       </w:r>
-      <w:r>
-        <w:t xml:space="preserve"> </w:t>
-      </w:r>
-      <w:r>
-        <w:t xml:space="preserve">- overcome difficulties 克服困难</w:t>
-      </w:r>
-      <w:r>
-        <w:t xml:space="preserve"> </w:t>
-      </w:r>
-      <w:r>
-        <w:t xml:space="preserve">- overcome obstacles 克服障碍</w:t>
-      </w:r>
-      <w:r>
-        <w:t xml:space="preserve"> </w:t>
-      </w:r>
-      <w:r>
-        <w:t xml:space="preserve">- overcome one’s fear 克服恐惧</w:t>
-      </w:r>
-      <w:r>
-        <w:t xml:space="preserve"> </w:t>
-      </w:r>
-      <w:r>
-        <w:t xml:space="preserve">- overcome prejudice 消除偏见</w:t>
-      </w:r>
-    </w:p>
-    <w:p>
-      <w:pPr>
-        <w:pStyle w:val="BlockText"/>
-      </w:pPr>
-      <w:r>
-        <w:t xml:space="preserve">▲ 注意它是</w:t>
-      </w:r>
-      <w:r>
-        <w:rPr>
-          <w:rFonts w:eastAsia="Noto Serif CJK SC SemiBold"/>
-          <w:b/>
-          <w:color w:val="1E293B"/>
-        </w:rPr>
-        <w:t xml:space="preserve">不规则动词</w:t>
-      </w:r>
-      <w:r>
-        <w:t xml:space="preserve">，过去分词与原形同形：overcome – overcame – overcome。高考语法填空常考。</w:t>
-      </w:r>
-    </w:p>
-    <w:p>
-      <w:pPr>
-        <w:pStyle w:val="BlockText"/>
-      </w:pPr>
-      <w:r>
-        <w:rPr>
-          <w:rFonts w:eastAsia="Noto Serif CJK SC SemiBold"/>
-          <w:b/>
-          <w:color w:val="1E293B"/>
-        </w:rPr>
-        <w:t xml:space="preserve">※ 高考迁移：✓✓</w:t>
-      </w:r>
-      <w:r>
-        <w:t xml:space="preserve"> </w:t>
-      </w:r>
-      <w:r>
-        <w:t xml:space="preserve">议论文里</w:t>
-      </w:r>
-      <w:r>
-        <w:t xml:space="preserve"> </w:t>
-      </w:r>
-      <w:r>
-        <w:rPr>
-          <w:rStyle w:val="VerbatimChar"/>
-        </w:rPr>
-        <w:t xml:space="preserve">overcome difficulties through unremitting efforts</w:t>
-      </w:r>
-      <w:r>
-        <w:t xml:space="preserve"> </w:t>
-      </w:r>
-      <w:r>
-        <w:t xml:space="preserve">比</w:t>
-      </w:r>
-      <w:r>
-        <w:t xml:space="preserve"> </w:t>
-      </w:r>
-      <w:r>
-        <w:rPr>
-          <w:rStyle w:val="VerbatimChar"/>
-        </w:rPr>
-        <w:t xml:space="preserve">solve difficulties</w:t>
-      </w:r>
-      <w:r>
-        <w:t xml:space="preserve"> </w:t>
-      </w:r>
-      <w:r>
-        <w:t xml:space="preserve">更地道。</w:t>
-      </w:r>
-    </w:p>
-    <w:p>
-      <w:pPr>
-        <w:pStyle w:val="FirstParagraph"/>
-        <w:keepNext/>
-        <w:widowControl/>
-        <w:spacing w:before="50" w:after="24" w:line="278" w:lineRule="auto"/>
-      </w:pPr>
-      <w:r>
-        <w:rPr>
-          <w:rFonts w:eastAsia="Noto Serif CJK SC SemiBold"/>
-          <w:b/>
-          <w:color w:val="8B1E1E"/>
-        </w:rPr>
-        <w:t xml:space="preserve">● 3. outbreak</w:t>
-      </w:r>
-      <w:r>
-        <w:rPr>
-          <w:rFonts w:eastAsia="Noto Serif CJK SC SemiBold"/>
-          <w:b/>
-          <w:color w:val="8B1E1E"/>
-        </w:rPr>
-        <w:t xml:space="preserve"> </w:t>
-      </w:r>
-      <w:r>
-        <w:rPr>
-          <w:rFonts w:eastAsia="Noto Serif CJK SC SemiBold"/>
-          <w:b/>
-          <w:color w:val="8B1E1E"/>
-        </w:rPr>
-        <w:t xml:space="preserve">/ˈaʊtbreɪk/ n.</w:t>
-      </w:r>
-    </w:p>
-    <w:p>
-      <w:pPr>
-        <w:pStyle w:val="BlockText"/>
-      </w:pPr>
-      <w:r>
-        <w:t xml:space="preserve">中文释义：（疾病、战争、火灾等坏事的）爆发</w:t>
-      </w:r>
-    </w:p>
-    <w:p>
-      <w:pPr>
-        <w:pStyle w:val="BlockText"/>
-      </w:pPr>
-      <w:r>
-        <w:t xml:space="preserve">构词：</w:t>
-      </w:r>
-      <w:r>
-        <w:rPr>
-          <w:rFonts w:eastAsia="Noto Serif CJK SC SemiBold"/>
-          <w:b/>
-          <w:color w:val="1E293B"/>
-        </w:rPr>
-        <w:t xml:space="preserve">out-（向外）+ break（破裂）→ 突然爆发出来</w:t>
-      </w:r>
-    </w:p>
-    <w:p>
-      <w:pPr>
-        <w:pStyle w:val="BlockText"/>
-      </w:pPr>
-      <w:r>
-        <w:rPr>
-          <w:rFonts w:eastAsia="Noto Serif CJK SC SemiBold"/>
-          <w:b/>
-          <w:color w:val="1E293B"/>
-        </w:rPr>
-        <w:t xml:space="preserve">原文：</w:t>
-      </w:r>
-      <w:r>
-        <w:t xml:space="preserve"> </w:t>
-      </w:r>
-      <w:r>
-        <w:t xml:space="preserve">when an outbreak of cholera hit Europe</w:t>
-      </w:r>
-      <w:r>
-        <w:t xml:space="preserve"> </w:t>
-      </w:r>
-      <w:r>
-        <w:t xml:space="preserve">当霍乱疫情袭击欧洲时</w:t>
-      </w:r>
-    </w:p>
-    <w:p>
-      <w:pPr>
-        <w:pStyle w:val="BlockText"/>
-      </w:pPr>
-      <w:r>
-        <w:t xml:space="preserve">常见搭配：</w:t>
-      </w:r>
-      <w:r>
-        <w:t xml:space="preserve"> </w:t>
-      </w:r>
-      <w:r>
-        <w:t xml:space="preserve">- an outbreak of cholera / flu / disease 疫情爆发</w:t>
-      </w:r>
-      <w:r>
-        <w:t xml:space="preserve"> </w:t>
-      </w:r>
-      <w:r>
-        <w:t xml:space="preserve">- an outbreak of war 战争爆发</w:t>
-      </w:r>
-      <w:r>
-        <w:t xml:space="preserve"> </w:t>
-      </w:r>
-      <w:r>
-        <w:t xml:space="preserve">- an outbreak of violence 暴力事件爆发</w:t>
-      </w:r>
-    </w:p>
-    <w:p>
-      <w:pPr>
-        <w:pStyle w:val="BlockText"/>
-      </w:pPr>
-      <w:r>
-        <w:rPr>
-          <w:rFonts w:eastAsia="Noto Serif CJK SC SemiBold"/>
-          <w:b/>
-          <w:color w:val="1E293B"/>
-        </w:rPr>
-        <w:t xml:space="preserve">注意：outbreak 只用于</w:t>
-      </w:r>
-      <w:r>
-        <w:rPr>
-          <w:rFonts w:eastAsia="Noto Serif CJK SC SemiBold"/>
-          <w:b/>
-          <w:color w:val="1E293B"/>
-        </w:rPr>
-        <w:t xml:space="preserve">“</w:t>
-      </w:r>
-      <w:r>
-        <w:rPr>
-          <w:rFonts w:eastAsia="Noto Serif CJK SC SemiBold"/>
-          <w:b/>
-          <w:color w:val="1E293B"/>
-        </w:rPr>
-        <w:t xml:space="preserve">坏事</w:t>
-      </w:r>
-      <w:r>
-        <w:rPr>
-          <w:rFonts w:eastAsia="Noto Serif CJK SC SemiBold"/>
-          <w:b/>
-          <w:color w:val="1E293B"/>
-        </w:rPr>
-        <w:t xml:space="preserve">”</w:t>
-      </w:r>
-      <w:r>
-        <w:t xml:space="preserve">，不能说 an outbreak of happiness。</w:t>
-      </w:r>
-    </w:p>
-    <w:p>
-      <w:pPr>
-        <w:pStyle w:val="BlockText"/>
-        <w:keepNext/>
-        <w:widowControl/>
-        <w:spacing w:before="50" w:after="24" w:line="278" w:lineRule="auto"/>
-      </w:pPr>
-      <w:r>
-        <w:rPr>
-          <w:rFonts w:eastAsia="Noto Serif CJK SC SemiBold"/>
-          <w:b/>
-          <w:color w:val="8B1E1E"/>
-        </w:rPr>
-        <w:t xml:space="preserve">● 这里的 hit 也很讲究</w:t>
-      </w:r>
-    </w:p>
-    <w:p>
-      <w:pPr>
-        <w:pStyle w:val="BlockText"/>
-      </w:pPr>
-      <w:r>
-        <w:rPr>
-          <w:rStyle w:val="VerbatimChar"/>
-        </w:rPr>
-        <w:t xml:space="preserve">hit</w:t>
-      </w:r>
-      <w:r>
-        <w:t xml:space="preserve"> </w:t>
-      </w:r>
-      <w:r>
-        <w:t xml:space="preserve">在这里不是</w:t>
-      </w:r>
-      <w:r>
-        <w:t xml:space="preserve">“</w:t>
-      </w:r>
-      <w:r>
-        <w:t xml:space="preserve">打</w:t>
-      </w:r>
-      <w:r>
-        <w:t xml:space="preserve">”</w:t>
-      </w:r>
-      <w:r>
-        <w:t xml:space="preserve">，而是</w:t>
-      </w:r>
-      <w:r>
-        <w:t xml:space="preserve">“</w:t>
-      </w:r>
-      <w:r>
-        <w:t xml:space="preserve">（灾害）袭击、重创</w:t>
-      </w:r>
-      <w:r>
-        <w:t xml:space="preserve">”</w:t>
-      </w:r>
-      <w:r>
-        <w:t xml:space="preserve">，是新闻英语的高频用法：</w:t>
-      </w:r>
     </w:p>
     <w:p>
       <w:pPr>
@@ -1898,7 +1600,7 @@
         <w:ind w:left="396" w:hanging="180"/>
       </w:pPr>
       <w:r>
-        <w:t xml:space="preserve">The earthquake hit the region at midnight. 地震在午夜袭击了该地区。</w:t>
+        <w:t xml:space="preserve">overcome difficulties 克服困难</w:t>
       </w:r>
     </w:p>
     <w:p>
@@ -1911,7 +1613,33 @@
         <w:ind w:left="396" w:hanging="180"/>
       </w:pPr>
       <w:r>
-        <w:t xml:space="preserve">The economy was hard hit by the crisis. 经济受到危机的严重冲击。</w:t>
+        <w:t xml:space="preserve">overcome obstacles 克服障碍</w:t>
+      </w:r>
+    </w:p>
+    <w:p>
+      <w:pPr>
+        <w:numPr>
+          <w:ilvl w:val="0"/>
+          <w:numId w:val="1005"/>
+        </w:numPr>
+        <w:pStyle w:val="Compact"/>
+        <w:ind w:left="396" w:hanging="180"/>
+      </w:pPr>
+      <w:r>
+        <w:t xml:space="preserve">overcome one’s fear 克服恐惧</w:t>
+      </w:r>
+    </w:p>
+    <w:p>
+      <w:pPr>
+        <w:numPr>
+          <w:ilvl w:val="0"/>
+          <w:numId w:val="1005"/>
+        </w:numPr>
+        <w:pStyle w:val="Compact"/>
+        <w:ind w:left="396" w:hanging="180"/>
+      </w:pPr>
+      <w:r>
+        <w:t xml:space="preserve">overcome prejudice 消除偏见</w:t>
       </w:r>
     </w:p>
     <w:p>
@@ -1919,6 +1647,25 @@
         <w:pStyle w:val="BlockText"/>
       </w:pPr>
       <w:r>
+        <w:t xml:space="preserve">▲ 注意它是</w:t>
+      </w:r>
+      <w:r>
+        <w:rPr>
+          <w:rFonts w:eastAsia="Noto Serif CJK SC SemiBold"/>
+          <w:b/>
+          <w:color w:val="1E293B"/>
+        </w:rPr>
+        <w:t xml:space="preserve">不规则动词</w:t>
+      </w:r>
+      <w:r>
+        <w:t xml:space="preserve">，过去分词与原形同形：overcome – overcame – overcome。高考语法填空常考。</w:t>
+      </w:r>
+    </w:p>
+    <w:p>
+      <w:pPr>
+        <w:pStyle w:val="BlockText"/>
+      </w:pPr>
+      <w:r>
         <w:rPr>
           <w:rFonts w:eastAsia="Noto Serif CJK SC SemiBold"/>
           <w:b/>
@@ -1930,16 +1677,37 @@
         <w:t xml:space="preserve"> </w:t>
       </w:r>
       <w:r>
+        <w:t xml:space="preserve">议论文里</w:t>
+      </w:r>
+      <w:r>
+        <w:t xml:space="preserve"> </w:t>
+      </w:r>
+      <w:r>
         <w:rPr>
           <w:rStyle w:val="VerbatimChar"/>
         </w:rPr>
-        <w:t xml:space="preserve">An outbreak of … hit …</w:t>
-      </w:r>
-      <w:r>
-        <w:t xml:space="preserve"> </w:t>
-      </w:r>
-      <w:r>
-        <w:t xml:space="preserve">是读后续写与应用文中描述突发事件的现成句型。</w:t>
+        <w:t xml:space="preserve">overcome difficulties through unremitting efforts</w:t>
+      </w:r>
+      <w:r>
+        <w:t xml:space="preserve"> </w:t>
+      </w:r>
+      <w:r>
+        <w:t xml:space="preserve">比</w:t>
+      </w:r>
+      <w:r>
+        <w:t xml:space="preserve"> </w:t>
+      </w:r>
+      <w:r>
+        <w:rPr>
+          <w:rStyle w:val="VerbatimChar"/>
+        </w:rPr>
+        <w:t xml:space="preserve">solve difficulties</w:t>
+      </w:r>
+      <w:r>
+        <w:t xml:space="preserve"> </w:t>
+      </w:r>
+      <w:r>
+        <w:t xml:space="preserve">更地道。</w:t>
       </w:r>
     </w:p>
     <w:p>
@@ -1955,7 +1723,23 @@
           <w:b/>
           <w:color w:val="8B1E1E"/>
         </w:rPr>
-        <w:t xml:space="preserve">● 4. die from vs. die of</w:t>
+        <w:t xml:space="preserve">● 3. outbreak</w:t>
+      </w:r>
+      <w:r>
+        <w:rPr>
+          <w:rFonts w:eastAsia="Noto Serif CJK SC SemiBold"/>
+          <w:b/>
+          <w:color w:val="8B1E1E"/>
+        </w:rPr>
+        <w:t xml:space="preserve"> </w:t>
+      </w:r>
+      <w:r>
+        <w:rPr>
+          <w:rFonts w:eastAsia="Noto Serif CJK SC SemiBold"/>
+          <w:b/>
+          <w:color w:val="8B1E1E"/>
+        </w:rPr>
+        <w:t xml:space="preserve">/ˈaʊtbreɪk/ n.</w:t>
       </w:r>
     </w:p>
     <w:p>
@@ -1963,19 +1747,56 @@
         <w:pStyle w:val="BlockText"/>
       </w:pPr>
       <w:r>
-        <w:t xml:space="preserve">两者都表示</w:t>
-      </w:r>
-      <w:r>
-        <w:t xml:space="preserve">“</w:t>
-      </w:r>
-      <w:r>
-        <w:t xml:space="preserve">死于</w:t>
-      </w:r>
-      <w:r>
-        <w:t xml:space="preserve">”</w:t>
-      </w:r>
-      <w:r>
-        <w:t xml:space="preserve">，传统上有细微分工：</w:t>
+        <w:t xml:space="preserve">中文释义：（疾病、战争、火灾等坏事的）爆发</w:t>
+      </w:r>
+    </w:p>
+    <w:p>
+      <w:pPr>
+        <w:pStyle w:val="BlockText"/>
+      </w:pPr>
+      <w:r>
+        <w:t xml:space="preserve">构词：</w:t>
+      </w:r>
+      <w:r>
+        <w:rPr>
+          <w:rFonts w:eastAsia="Noto Serif CJK SC SemiBold"/>
+          <w:b/>
+          <w:color w:val="1E293B"/>
+        </w:rPr>
+        <w:t xml:space="preserve">out-（向外）+ break（破裂）→ 突然爆发出来</w:t>
+      </w:r>
+    </w:p>
+    <w:p>
+      <w:pPr>
+        <w:pStyle w:val="BlockText"/>
+      </w:pPr>
+      <w:r>
+        <w:rPr>
+          <w:rFonts w:eastAsia="Noto Serif CJK SC SemiBold"/>
+          <w:b/>
+          <w:color w:val="1E293B"/>
+        </w:rPr>
+        <w:t xml:space="preserve">原文：</w:t>
+      </w:r>
+      <w:r>
+        <w:t xml:space="preserve"> </w:t>
+      </w:r>
+      <w:r>
+        <w:t xml:space="preserve">when an outbreak of cholera hit Europe</w:t>
+      </w:r>
+      <w:r>
+        <w:t xml:space="preserve"> </w:t>
+      </w:r>
+      <w:r>
+        <w:t xml:space="preserve">当霍乱疫情袭击欧洲时</w:t>
+      </w:r>
+    </w:p>
+    <w:p>
+      <w:pPr>
+        <w:pStyle w:val="BlockText"/>
+      </w:pPr>
+      <w:r>
+        <w:t xml:space="preserve">常见搭配：</w:t>
       </w:r>
     </w:p>
     <w:p>
@@ -1988,49 +1809,7 @@
         <w:ind w:left="396" w:hanging="180"/>
       </w:pPr>
       <w:r>
-        <w:rPr>
-          <w:rFonts w:eastAsia="Noto Serif CJK SC SemiBold"/>
-          <w:b/>
-          <w:color w:val="1E293B"/>
-        </w:rPr>
-        <w:t xml:space="preserve">die of</w:t>
-      </w:r>
-      <w:r>
-        <w:t xml:space="preserve"> </w:t>
-      </w:r>
-      <w:r>
-        <w:t xml:space="preserve">→ 多用于</w:t>
-      </w:r>
-      <w:r>
-        <w:rPr>
-          <w:rFonts w:eastAsia="Noto Serif CJK SC SemiBold"/>
-          <w:b/>
-          <w:color w:val="1E293B"/>
-        </w:rPr>
-        <w:t xml:space="preserve">疾病、饥饿、衰老、情绪</w:t>
-      </w:r>
-      <w:r>
-        <w:t xml:space="preserve">等</w:t>
-      </w:r>
-      <w:r>
-        <w:rPr>
-          <w:rFonts w:eastAsia="Noto Serif CJK SC SemiBold"/>
-          <w:b/>
-          <w:color w:val="1E293B"/>
-        </w:rPr>
-        <w:t xml:space="preserve">内在</w:t>
-      </w:r>
-      <w:r>
-        <w:t xml:space="preserve">原因</w:t>
-      </w:r>
-      <w:r>
-        <w:t xml:space="preserve"> </w:t>
-      </w:r>
-      <w:r>
-        <w:rPr>
-          <w:rStyle w:val="VerbatimChar"/>
-        </w:rPr>
-        <w:t xml:space="preserve">die of cancer / hunger / old age</w:t>
+        <w:t xml:space="preserve">an outbreak of cholera / flu / disease 疫情爆发</w:t>
       </w:r>
     </w:p>
     <w:p>
@@ -2043,6 +1822,274 @@
         <w:ind w:left="396" w:hanging="180"/>
       </w:pPr>
       <w:r>
+        <w:t xml:space="preserve">an outbreak of war 战争爆发</w:t>
+      </w:r>
+    </w:p>
+    <w:p>
+      <w:pPr>
+        <w:numPr>
+          <w:ilvl w:val="0"/>
+          <w:numId w:val="1006"/>
+        </w:numPr>
+        <w:pStyle w:val="Compact"/>
+        <w:ind w:left="396" w:hanging="180"/>
+      </w:pPr>
+      <w:r>
+        <w:t xml:space="preserve">an outbreak of violence 暴力事件爆发</w:t>
+      </w:r>
+    </w:p>
+    <w:p>
+      <w:pPr>
+        <w:pStyle w:val="BlockText"/>
+      </w:pPr>
+      <w:r>
+        <w:rPr>
+          <w:rFonts w:eastAsia="Noto Serif CJK SC SemiBold"/>
+          <w:b/>
+          <w:color w:val="1E293B"/>
+        </w:rPr>
+        <w:t xml:space="preserve">注意：outbreak 只用于</w:t>
+      </w:r>
+      <w:r>
+        <w:rPr>
+          <w:rFonts w:eastAsia="Noto Serif CJK SC SemiBold"/>
+          <w:b/>
+          <w:color w:val="1E293B"/>
+        </w:rPr>
+        <w:t xml:space="preserve">“</w:t>
+      </w:r>
+      <w:r>
+        <w:rPr>
+          <w:rFonts w:eastAsia="Noto Serif CJK SC SemiBold"/>
+          <w:b/>
+          <w:color w:val="1E293B"/>
+        </w:rPr>
+        <w:t xml:space="preserve">坏事</w:t>
+      </w:r>
+      <w:r>
+        <w:rPr>
+          <w:rFonts w:eastAsia="Noto Serif CJK SC SemiBold"/>
+          <w:b/>
+          <w:color w:val="1E293B"/>
+        </w:rPr>
+        <w:t xml:space="preserve">”</w:t>
+      </w:r>
+      <w:r>
+        <w:t xml:space="preserve">，不能说 an outbreak of happiness。</w:t>
+      </w:r>
+    </w:p>
+    <w:p>
+      <w:pPr>
+        <w:pStyle w:val="BlockText"/>
+        <w:keepNext/>
+        <w:widowControl/>
+        <w:spacing w:before="50" w:after="24" w:line="278" w:lineRule="auto"/>
+      </w:pPr>
+      <w:r>
+        <w:rPr>
+          <w:rFonts w:eastAsia="Noto Serif CJK SC SemiBold"/>
+          <w:b/>
+          <w:color w:val="8B1E1E"/>
+        </w:rPr>
+        <w:t xml:space="preserve">● 这里的 hit 也很讲究</w:t>
+      </w:r>
+    </w:p>
+    <w:p>
+      <w:pPr>
+        <w:pStyle w:val="BlockText"/>
+      </w:pPr>
+      <w:r>
+        <w:rPr>
+          <w:rStyle w:val="VerbatimChar"/>
+        </w:rPr>
+        <w:t xml:space="preserve">hit</w:t>
+      </w:r>
+      <w:r>
+        <w:t xml:space="preserve"> </w:t>
+      </w:r>
+      <w:r>
+        <w:t xml:space="preserve">在这里不是</w:t>
+      </w:r>
+      <w:r>
+        <w:t xml:space="preserve">“</w:t>
+      </w:r>
+      <w:r>
+        <w:t xml:space="preserve">打</w:t>
+      </w:r>
+      <w:r>
+        <w:t xml:space="preserve">”</w:t>
+      </w:r>
+      <w:r>
+        <w:t xml:space="preserve">，而是</w:t>
+      </w:r>
+      <w:r>
+        <w:t xml:space="preserve">“</w:t>
+      </w:r>
+      <w:r>
+        <w:t xml:space="preserve">（灾害）袭击、重创</w:t>
+      </w:r>
+      <w:r>
+        <w:t xml:space="preserve">”</w:t>
+      </w:r>
+      <w:r>
+        <w:t xml:space="preserve">，是新闻英语的高频用法：</w:t>
+      </w:r>
+    </w:p>
+    <w:p>
+      <w:pPr>
+        <w:numPr>
+          <w:ilvl w:val="0"/>
+          <w:numId w:val="1007"/>
+        </w:numPr>
+        <w:pStyle w:val="Compact"/>
+        <w:ind w:left="396" w:hanging="180"/>
+      </w:pPr>
+      <w:r>
+        <w:t xml:space="preserve">The earthquake hit the region at midnight. 地震在午夜袭击了该地区。</w:t>
+      </w:r>
+    </w:p>
+    <w:p>
+      <w:pPr>
+        <w:numPr>
+          <w:ilvl w:val="0"/>
+          <w:numId w:val="1007"/>
+        </w:numPr>
+        <w:pStyle w:val="Compact"/>
+        <w:ind w:left="396" w:hanging="180"/>
+      </w:pPr>
+      <w:r>
+        <w:t xml:space="preserve">The economy was hard hit by the crisis. 经济受到危机的严重冲击。</w:t>
+      </w:r>
+    </w:p>
+    <w:p>
+      <w:pPr>
+        <w:pStyle w:val="BlockText"/>
+      </w:pPr>
+      <w:r>
+        <w:rPr>
+          <w:rFonts w:eastAsia="Noto Serif CJK SC SemiBold"/>
+          <w:b/>
+          <w:color w:val="1E293B"/>
+        </w:rPr>
+        <w:t xml:space="preserve">※ 高考迁移：✓✓</w:t>
+      </w:r>
+      <w:r>
+        <w:t xml:space="preserve"> </w:t>
+      </w:r>
+      <w:r>
+        <w:rPr>
+          <w:rStyle w:val="VerbatimChar"/>
+        </w:rPr>
+        <w:t xml:space="preserve">An outbreak of … hit …</w:t>
+      </w:r>
+      <w:r>
+        <w:t xml:space="preserve"> </w:t>
+      </w:r>
+      <w:r>
+        <w:t xml:space="preserve">是读后续写与应用文中描述突发事件的现成句型。</w:t>
+      </w:r>
+    </w:p>
+    <w:p>
+      <w:pPr>
+        <w:pStyle w:val="FirstParagraph"/>
+        <w:keepNext/>
+        <w:widowControl/>
+        <w:spacing w:before="50" w:after="24" w:line="278" w:lineRule="auto"/>
+      </w:pPr>
+      <w:r>
+        <w:rPr>
+          <w:rFonts w:eastAsia="Noto Serif CJK SC SemiBold"/>
+          <w:b/>
+          <w:color w:val="8B1E1E"/>
+        </w:rPr>
+        <w:t xml:space="preserve">● 4. die from vs. die of</w:t>
+      </w:r>
+    </w:p>
+    <w:p>
+      <w:pPr>
+        <w:pStyle w:val="BlockText"/>
+      </w:pPr>
+      <w:r>
+        <w:t xml:space="preserve">两者都表示</w:t>
+      </w:r>
+      <w:r>
+        <w:t xml:space="preserve">“</w:t>
+      </w:r>
+      <w:r>
+        <w:t xml:space="preserve">死于</w:t>
+      </w:r>
+      <w:r>
+        <w:t xml:space="preserve">”</w:t>
+      </w:r>
+      <w:r>
+        <w:t xml:space="preserve">，传统上有细微分工：</w:t>
+      </w:r>
+    </w:p>
+    <w:p>
+      <w:pPr>
+        <w:numPr>
+          <w:ilvl w:val="0"/>
+          <w:numId w:val="1008"/>
+        </w:numPr>
+        <w:pStyle w:val="Compact"/>
+        <w:ind w:left="396" w:hanging="180"/>
+      </w:pPr>
+      <w:r>
+        <w:rPr>
+          <w:rFonts w:eastAsia="Noto Serif CJK SC SemiBold"/>
+          <w:b/>
+          <w:color w:val="1E293B"/>
+        </w:rPr>
+        <w:t xml:space="preserve">die of</w:t>
+      </w:r>
+      <w:r>
+        <w:t xml:space="preserve"> </w:t>
+      </w:r>
+      <w:r>
+        <w:t xml:space="preserve">→ 多用于</w:t>
+      </w:r>
+      <w:r>
+        <w:rPr>
+          <w:rFonts w:eastAsia="Noto Serif CJK SC SemiBold"/>
+          <w:b/>
+          <w:color w:val="1E293B"/>
+        </w:rPr>
+        <w:t xml:space="preserve">疾病、饥饿、衰老、情绪</w:t>
+      </w:r>
+      <w:r>
+        <w:t xml:space="preserve">等</w:t>
+      </w:r>
+      <w:r>
+        <w:rPr>
+          <w:rFonts w:eastAsia="Noto Serif CJK SC SemiBold"/>
+          <w:b/>
+          <w:color w:val="1E293B"/>
+        </w:rPr>
+        <w:t xml:space="preserve">内在</w:t>
+      </w:r>
+      <w:r>
+        <w:t xml:space="preserve">原因</w:t>
+      </w:r>
+      <w:r>
+        <w:t xml:space="preserve"> </w:t>
+      </w:r>
+      <w:r>
+        <w:rPr>
+          <w:rStyle w:val="VerbatimChar"/>
+        </w:rPr>
+        <w:t xml:space="preserve">die of cancer / hunger / old age</w:t>
+      </w:r>
+    </w:p>
+    <w:p>
+      <w:pPr>
+        <w:numPr>
+          <w:ilvl w:val="0"/>
+          <w:numId w:val="1008"/>
+        </w:numPr>
+        <w:pStyle w:val="Compact"/>
+        <w:ind w:left="396" w:hanging="180"/>
+      </w:pPr>
+      <w:r>
         <w:rPr>
           <w:rFonts w:eastAsia="Noto Serif CJK SC SemiBold"/>
           <w:b/>
@@ -2086,11 +2133,18 @@
         </w:rPr>
         <w:t xml:space="preserve">原文两处都出现了：</w:t>
       </w:r>
-      <w:r>
-        <w:t xml:space="preserve"> </w:t>
-      </w:r>
-      <w:r>
-        <w:t xml:space="preserve">- 第一段：millions of people</w:t>
+    </w:p>
+    <w:p>
+      <w:pPr>
+        <w:numPr>
+          <w:ilvl w:val="0"/>
+          <w:numId w:val="1009"/>
+        </w:numPr>
+        <w:pStyle w:val="Compact"/>
+        <w:ind w:left="396" w:hanging="180"/>
+      </w:pPr>
+      <w:r>
+        <w:t xml:space="preserve">第一段：millions of people</w:t>
       </w:r>
       <w:r>
         <w:t xml:space="preserve"> </w:t>
@@ -2109,11 +2163,18 @@
       <w:r>
         <w:t xml:space="preserve">the disease</w:t>
       </w:r>
-      <w:r>
-        <w:t xml:space="preserve"> </w:t>
-      </w:r>
-      <w:r>
-        <w:t xml:space="preserve">- 第三段：a woman and her daughter had</w:t>
+    </w:p>
+    <w:p>
+      <w:pPr>
+        <w:numPr>
+          <w:ilvl w:val="0"/>
+          <w:numId w:val="1009"/>
+        </w:numPr>
+        <w:pStyle w:val="Compact"/>
+        <w:ind w:left="396" w:hanging="180"/>
+      </w:pPr>
+      <w:r>
+        <w:t xml:space="preserve">第三段：a woman and her daughter had</w:t>
       </w:r>
       <w:r>
         <w:t xml:space="preserve"> </w:t>
@@ -2526,23 +2587,44 @@
       <w:r>
         <w:t xml:space="preserve">常见搭配：</w:t>
       </w:r>
-      <w:r>
-        <w:t xml:space="preserve"> </w:t>
-      </w:r>
-      <w:r>
-        <w:t xml:space="preserve">- attend to a patient 照料病人</w:t>
-      </w:r>
-      <w:r>
-        <w:t xml:space="preserve"> </w:t>
-      </w:r>
-      <w:r>
-        <w:t xml:space="preserve">- attend to the matter 处理这件事</w:t>
-      </w:r>
-      <w:r>
-        <w:t xml:space="preserve"> </w:t>
-      </w:r>
-      <w:r>
-        <w:t xml:space="preserve">- attend to one’s needs 满足某人的需要</w:t>
+    </w:p>
+    <w:p>
+      <w:pPr>
+        <w:numPr>
+          <w:ilvl w:val="0"/>
+          <w:numId w:val="1010"/>
+        </w:numPr>
+        <w:pStyle w:val="Compact"/>
+        <w:ind w:left="396" w:hanging="180"/>
+      </w:pPr>
+      <w:r>
+        <w:t xml:space="preserve">attend to a patient 照料病人</w:t>
+      </w:r>
+    </w:p>
+    <w:p>
+      <w:pPr>
+        <w:numPr>
+          <w:ilvl w:val="0"/>
+          <w:numId w:val="1010"/>
+        </w:numPr>
+        <w:pStyle w:val="Compact"/>
+        <w:ind w:left="396" w:hanging="180"/>
+      </w:pPr>
+      <w:r>
+        <w:t xml:space="preserve">attend to the matter 处理这件事</w:t>
+      </w:r>
+    </w:p>
+    <w:p>
+      <w:pPr>
+        <w:numPr>
+          <w:ilvl w:val="0"/>
+          <w:numId w:val="1010"/>
+        </w:numPr>
+        <w:pStyle w:val="Compact"/>
+        <w:ind w:left="396" w:hanging="180"/>
+      </w:pPr>
+      <w:r>
+        <w:t xml:space="preserve">attend to one’s needs 满足某人的需要</w:t>
       </w:r>
     </w:p>
     <w:p>
@@ -2706,7 +2788,7 @@
       <w:pPr>
         <w:numPr>
           <w:ilvl w:val="0"/>
-          <w:numId w:val="1007"/>
+          <w:numId w:val="1011"/>
         </w:numPr>
         <w:pStyle w:val="Compact"/>
         <w:ind w:left="396" w:hanging="180"/>
@@ -2719,7 +2801,7 @@
       <w:pPr>
         <w:numPr>
           <w:ilvl w:val="0"/>
-          <w:numId w:val="1007"/>
+          <w:numId w:val="1011"/>
         </w:numPr>
         <w:pStyle w:val="Compact"/>
         <w:ind w:left="396" w:hanging="180"/>
@@ -3581,7 +3663,7 @@
       <w:pPr>
         <w:numPr>
           <w:ilvl w:val="0"/>
-          <w:numId w:val="1008"/>
+          <w:numId w:val="1012"/>
         </w:numPr>
         <w:pStyle w:val="Compact"/>
         <w:ind w:left="396" w:hanging="180"/>
@@ -3605,7 +3687,7 @@
       <w:pPr>
         <w:numPr>
           <w:ilvl w:val="0"/>
-          <w:numId w:val="1008"/>
+          <w:numId w:val="1012"/>
         </w:numPr>
         <w:pStyle w:val="Compact"/>
         <w:ind w:left="396" w:hanging="180"/>
@@ -3629,7 +3711,7 @@
       <w:pPr>
         <w:numPr>
           <w:ilvl w:val="0"/>
-          <w:numId w:val="1008"/>
+          <w:numId w:val="1012"/>
         </w:numPr>
         <w:pStyle w:val="Compact"/>
         <w:ind w:left="396" w:hanging="180"/>
@@ -3673,7 +3755,7 @@
       <w:pPr>
         <w:numPr>
           <w:ilvl w:val="0"/>
-          <w:numId w:val="1008"/>
+          <w:numId w:val="1012"/>
         </w:numPr>
         <w:pStyle w:val="Compact"/>
         <w:ind w:left="396" w:hanging="180"/>
@@ -3697,7 +3779,7 @@
       <w:pPr>
         <w:numPr>
           <w:ilvl w:val="0"/>
-          <w:numId w:val="1008"/>
+          <w:numId w:val="1012"/>
         </w:numPr>
         <w:pStyle w:val="Compact"/>
         <w:ind w:left="396" w:hanging="180"/>
@@ -3721,7 +3803,7 @@
       <w:pPr>
         <w:numPr>
           <w:ilvl w:val="0"/>
-          <w:numId w:val="1008"/>
+          <w:numId w:val="1012"/>
         </w:numPr>
         <w:pStyle w:val="Compact"/>
         <w:ind w:left="396" w:hanging="180"/>
@@ -3745,7 +3827,7 @@
       <w:pPr>
         <w:numPr>
           <w:ilvl w:val="0"/>
-          <w:numId w:val="1008"/>
+          <w:numId w:val="1012"/>
         </w:numPr>
         <w:pStyle w:val="Compact"/>
         <w:ind w:left="396" w:hanging="180"/>
@@ -3769,7 +3851,7 @@
       <w:pPr>
         <w:numPr>
           <w:ilvl w:val="0"/>
-          <w:numId w:val="1008"/>
+          <w:numId w:val="1012"/>
         </w:numPr>
         <w:pStyle w:val="Compact"/>
         <w:ind w:left="396" w:hanging="180"/>
@@ -3955,23 +4037,44 @@
       <w:r>
         <w:t xml:space="preserve">词族一起记：</w:t>
       </w:r>
-      <w:r>
-        <w:t xml:space="preserve"> </w:t>
-      </w:r>
-      <w:r>
-        <w:t xml:space="preserve">- contradict v. 反驳；与……矛盾</w:t>
-      </w:r>
-      <w:r>
-        <w:t xml:space="preserve"> </w:t>
-      </w:r>
-      <w:r>
-        <w:t xml:space="preserve">- contradiction n. 矛盾</w:t>
-      </w:r>
-      <w:r>
-        <w:t xml:space="preserve"> </w:t>
-      </w:r>
-      <w:r>
-        <w:t xml:space="preserve">- contradictory adj. 矛盾的</w:t>
+    </w:p>
+    <w:p>
+      <w:pPr>
+        <w:numPr>
+          <w:ilvl w:val="0"/>
+          <w:numId w:val="1013"/>
+        </w:numPr>
+        <w:pStyle w:val="Compact"/>
+        <w:ind w:left="396" w:hanging="180"/>
+      </w:pPr>
+      <w:r>
+        <w:t xml:space="preserve">contradict v. 反驳；与……矛盾</w:t>
+      </w:r>
+    </w:p>
+    <w:p>
+      <w:pPr>
+        <w:numPr>
+          <w:ilvl w:val="0"/>
+          <w:numId w:val="1013"/>
+        </w:numPr>
+        <w:pStyle w:val="Compact"/>
+        <w:ind w:left="396" w:hanging="180"/>
+      </w:pPr>
+      <w:r>
+        <w:t xml:space="preserve">contradiction n. 矛盾</w:t>
+      </w:r>
+    </w:p>
+    <w:p>
+      <w:pPr>
+        <w:numPr>
+          <w:ilvl w:val="0"/>
+          <w:numId w:val="1013"/>
+        </w:numPr>
+        <w:pStyle w:val="Compact"/>
+        <w:ind w:left="396" w:hanging="180"/>
+      </w:pPr>
+      <w:r>
+        <w:t xml:space="preserve">contradictory adj. 矛盾的</w:t>
       </w:r>
     </w:p>
     <w:p>
@@ -3981,23 +4084,44 @@
       <w:r>
         <w:t xml:space="preserve">常见搭配：</w:t>
       </w:r>
-      <w:r>
-        <w:t xml:space="preserve"> </w:t>
-      </w:r>
-      <w:r>
-        <w:t xml:space="preserve">- contradictory theories 相互矛盾的理论</w:t>
-      </w:r>
-      <w:r>
-        <w:t xml:space="preserve"> </w:t>
-      </w:r>
-      <w:r>
-        <w:t xml:space="preserve">- contradictory evidence 相互矛盾的证据</w:t>
-      </w:r>
-      <w:r>
-        <w:t xml:space="preserve"> </w:t>
-      </w:r>
-      <w:r>
-        <w:t xml:space="preserve">- contradictory views 对立的观点</w:t>
+    </w:p>
+    <w:p>
+      <w:pPr>
+        <w:numPr>
+          <w:ilvl w:val="0"/>
+          <w:numId w:val="1014"/>
+        </w:numPr>
+        <w:pStyle w:val="Compact"/>
+        <w:ind w:left="396" w:hanging="180"/>
+      </w:pPr>
+      <w:r>
+        <w:t xml:space="preserve">contradictory theories 相互矛盾的理论</w:t>
+      </w:r>
+    </w:p>
+    <w:p>
+      <w:pPr>
+        <w:numPr>
+          <w:ilvl w:val="0"/>
+          <w:numId w:val="1014"/>
+        </w:numPr>
+        <w:pStyle w:val="Compact"/>
+        <w:ind w:left="396" w:hanging="180"/>
+      </w:pPr>
+      <w:r>
+        <w:t xml:space="preserve">contradictory evidence 相互矛盾的证据</w:t>
+      </w:r>
+    </w:p>
+    <w:p>
+      <w:pPr>
+        <w:numPr>
+          <w:ilvl w:val="0"/>
+          <w:numId w:val="1014"/>
+        </w:numPr>
+        <w:pStyle w:val="Compact"/>
+        <w:ind w:left="396" w:hanging="180"/>
+      </w:pPr>
+      <w:r>
+        <w:t xml:space="preserve">contradictory views 对立的观点</w:t>
       </w:r>
     </w:p>
     <w:p>
@@ -4214,17 +4338,31 @@
       <w:r>
         <w:t xml:space="preserve">常见搭配：</w:t>
       </w:r>
-      <w:r>
-        <w:t xml:space="preserve"> </w:t>
-      </w:r>
-      <w:r>
-        <w:t xml:space="preserve">- subscribe to a theory / view / belief 赞同某种理论/观点/信念</w:t>
-      </w:r>
-      <w:r>
-        <w:t xml:space="preserve"> </w:t>
-      </w:r>
-      <w:r>
-        <w:t xml:space="preserve">- subscribe to a magazine 订阅杂志</w:t>
+    </w:p>
+    <w:p>
+      <w:pPr>
+        <w:numPr>
+          <w:ilvl w:val="0"/>
+          <w:numId w:val="1015"/>
+        </w:numPr>
+        <w:pStyle w:val="Compact"/>
+        <w:ind w:left="396" w:hanging="180"/>
+      </w:pPr>
+      <w:r>
+        <w:t xml:space="preserve">subscribe to a theory / view / belief 赞同某种理论/观点/信念</w:t>
+      </w:r>
+    </w:p>
+    <w:p>
+      <w:pPr>
+        <w:numPr>
+          <w:ilvl w:val="0"/>
+          <w:numId w:val="1015"/>
+        </w:numPr>
+        <w:pStyle w:val="Compact"/>
+        <w:ind w:left="396" w:hanging="180"/>
+      </w:pPr>
+      <w:r>
+        <w:t xml:space="preserve">subscribe to a magazine 订阅杂志</w:t>
       </w:r>
     </w:p>
     <w:p>
@@ -4694,29 +4832,57 @@
       <w:r>
         <w:t xml:space="preserve">常见搭配：</w:t>
       </w:r>
-      <w:r>
-        <w:t xml:space="preserve"> </w:t>
-      </w:r>
-      <w:r>
-        <w:t xml:space="preserve">- need proof 需要证据</w:t>
-      </w:r>
-      <w:r>
-        <w:t xml:space="preserve"> </w:t>
-      </w:r>
-      <w:r>
-        <w:t xml:space="preserve">- have proof of… 有……的证明</w:t>
-      </w:r>
-      <w:r>
-        <w:t xml:space="preserve"> </w:t>
-      </w:r>
-      <w:r>
-        <w:t xml:space="preserve">- There is no proof that… 没有证据表明……</w:t>
-      </w:r>
-      <w:r>
-        <w:t xml:space="preserve"> </w:t>
-      </w:r>
-      <w:r>
-        <w:t xml:space="preserve">- conclusive proof 决定性证据</w:t>
+    </w:p>
+    <w:p>
+      <w:pPr>
+        <w:numPr>
+          <w:ilvl w:val="0"/>
+          <w:numId w:val="1016"/>
+        </w:numPr>
+        <w:pStyle w:val="Compact"/>
+        <w:ind w:left="396" w:hanging="180"/>
+      </w:pPr>
+      <w:r>
+        <w:t xml:space="preserve">need proof 需要证据</w:t>
+      </w:r>
+    </w:p>
+    <w:p>
+      <w:pPr>
+        <w:numPr>
+          <w:ilvl w:val="0"/>
+          <w:numId w:val="1016"/>
+        </w:numPr>
+        <w:pStyle w:val="Compact"/>
+        <w:ind w:left="396" w:hanging="180"/>
+      </w:pPr>
+      <w:r>
+        <w:t xml:space="preserve">have proof of… 有……的证明</w:t>
+      </w:r>
+    </w:p>
+    <w:p>
+      <w:pPr>
+        <w:numPr>
+          <w:ilvl w:val="0"/>
+          <w:numId w:val="1016"/>
+        </w:numPr>
+        <w:pStyle w:val="Compact"/>
+        <w:ind w:left="396" w:hanging="180"/>
+      </w:pPr>
+      <w:r>
+        <w:t xml:space="preserve">There is no proof that… 没有证据表明……</w:t>
+      </w:r>
+    </w:p>
+    <w:p>
+      <w:pPr>
+        <w:numPr>
+          <w:ilvl w:val="0"/>
+          <w:numId w:val="1016"/>
+        </w:numPr>
+        <w:pStyle w:val="Compact"/>
+        <w:ind w:left="396" w:hanging="180"/>
+      </w:pPr>
+      <w:r>
+        <w:t xml:space="preserve">conclusive proof 决定性证据</w:t>
       </w:r>
     </w:p>
     <w:p>
@@ -5253,15 +5419,16 @@
         </w:rPr>
         <w:t xml:space="preserve">两个高频错误：</w:t>
       </w:r>
-      <w:r>
-        <w:t xml:space="preserve"> </w:t>
-      </w:r>
-      <w:r>
-        <w:t xml:space="preserve">1.</w:t>
-      </w:r>
-      <w:r>
-        <w:t xml:space="preserve"> </w:t>
-      </w:r>
+    </w:p>
+    <w:p>
+      <w:pPr>
+        <w:numPr>
+          <w:ilvl w:val="0"/>
+          <w:numId w:val="1017"/>
+        </w:numPr>
+        <w:pStyle w:val="Compact"/>
+        <w:ind w:left="396" w:hanging="180"/>
+      </w:pPr>
       <w:r>
         <w:rPr>
           <w:rStyle w:val="VerbatimChar"/>
@@ -5297,15 +5464,16 @@
       <w:r>
         <w:t xml:space="preserve">✓ It rained. Consequently, we stayed home.</w:t>
       </w:r>
-      <w:r>
-        <w:t xml:space="preserve"> </w:t>
-      </w:r>
-      <w:r>
-        <w:t xml:space="preserve">2.</w:t>
-      </w:r>
-      <w:r>
-        <w:t xml:space="preserve"> </w:t>
-      </w:r>
+    </w:p>
+    <w:p>
+      <w:pPr>
+        <w:numPr>
+          <w:ilvl w:val="0"/>
+          <w:numId w:val="1017"/>
+        </w:numPr>
+        <w:pStyle w:val="Compact"/>
+        <w:ind w:left="396" w:hanging="180"/>
+      </w:pPr>
       <w:r>
         <w:rPr>
           <w:rStyle w:val="VerbatimChar"/>
@@ -5430,7 +5598,7 @@
       <w:pPr>
         <w:numPr>
           <w:ilvl w:val="0"/>
-          <w:numId w:val="1009"/>
+          <w:numId w:val="1018"/>
         </w:numPr>
         <w:pStyle w:val="Compact"/>
         <w:ind w:left="396" w:hanging="180"/>
@@ -5486,7 +5654,7 @@
       <w:pPr>
         <w:numPr>
           <w:ilvl w:val="0"/>
-          <w:numId w:val="1009"/>
+          <w:numId w:val="1018"/>
         </w:numPr>
         <w:pStyle w:val="Compact"/>
         <w:ind w:left="396" w:hanging="180"/>
@@ -5517,7 +5685,7 @@
       <w:pPr>
         <w:numPr>
           <w:ilvl w:val="0"/>
-          <w:numId w:val="1009"/>
+          <w:numId w:val="1018"/>
         </w:numPr>
         <w:pStyle w:val="Compact"/>
         <w:ind w:left="396" w:hanging="180"/>
@@ -5636,23 +5804,44 @@
       <w:r>
         <w:t xml:space="preserve">词族：</w:t>
       </w:r>
-      <w:r>
-        <w:t xml:space="preserve"> </w:t>
-      </w:r>
-      <w:r>
-        <w:t xml:space="preserve">- determine v. 决定；查明</w:t>
-      </w:r>
-      <w:r>
-        <w:t xml:space="preserve"> </w:t>
-      </w:r>
-      <w:r>
-        <w:t xml:space="preserve">- determined adj. 坚定的</w:t>
-      </w:r>
-      <w:r>
-        <w:t xml:space="preserve"> </w:t>
-      </w:r>
-      <w:r>
-        <w:t xml:space="preserve">- determination n. 决心</w:t>
+    </w:p>
+    <w:p>
+      <w:pPr>
+        <w:numPr>
+          <w:ilvl w:val="0"/>
+          <w:numId w:val="1019"/>
+        </w:numPr>
+        <w:pStyle w:val="Compact"/>
+        <w:ind w:left="396" w:hanging="180"/>
+      </w:pPr>
+      <w:r>
+        <w:t xml:space="preserve">determine v. 决定；查明</w:t>
+      </w:r>
+    </w:p>
+    <w:p>
+      <w:pPr>
+        <w:numPr>
+          <w:ilvl w:val="0"/>
+          <w:numId w:val="1019"/>
+        </w:numPr>
+        <w:pStyle w:val="Compact"/>
+        <w:ind w:left="396" w:hanging="180"/>
+      </w:pPr>
+      <w:r>
+        <w:t xml:space="preserve">determined adj. 坚定的</w:t>
+      </w:r>
+    </w:p>
+    <w:p>
+      <w:pPr>
+        <w:numPr>
+          <w:ilvl w:val="0"/>
+          <w:numId w:val="1019"/>
+        </w:numPr>
+        <w:pStyle w:val="Compact"/>
+        <w:ind w:left="396" w:hanging="180"/>
+      </w:pPr>
+      <w:r>
+        <w:t xml:space="preserve">determination n. 决心</w:t>
       </w:r>
     </w:p>
     <w:p>
@@ -7286,7 +7475,7 @@
       <w:pPr>
         <w:numPr>
           <w:ilvl w:val="0"/>
-          <w:numId w:val="1010"/>
+          <w:numId w:val="1020"/>
         </w:numPr>
         <w:pStyle w:val="Compact"/>
         <w:ind w:left="396" w:hanging="180"/>
@@ -7310,7 +7499,7 @@
       <w:pPr>
         <w:numPr>
           <w:ilvl w:val="0"/>
-          <w:numId w:val="1010"/>
+          <w:numId w:val="1020"/>
         </w:numPr>
         <w:pStyle w:val="Compact"/>
         <w:ind w:left="396" w:hanging="180"/>
@@ -7334,7 +7523,7 @@
       <w:pPr>
         <w:numPr>
           <w:ilvl w:val="0"/>
-          <w:numId w:val="1010"/>
+          <w:numId w:val="1020"/>
         </w:numPr>
         <w:pStyle w:val="Compact"/>
         <w:ind w:left="396" w:hanging="180"/>
@@ -7358,7 +7547,7 @@
       <w:pPr>
         <w:numPr>
           <w:ilvl w:val="0"/>
-          <w:numId w:val="1010"/>
+          <w:numId w:val="1020"/>
         </w:numPr>
         <w:pStyle w:val="Compact"/>
         <w:ind w:left="396" w:hanging="180"/>
@@ -7449,7 +7638,7 @@
       <w:pPr>
         <w:numPr>
           <w:ilvl w:val="0"/>
-          <w:numId w:val="1010"/>
+          <w:numId w:val="1020"/>
         </w:numPr>
         <w:pStyle w:val="Compact"/>
         <w:ind w:left="396" w:hanging="180"/>
@@ -7484,7 +7673,7 @@
       <w:pPr>
         <w:numPr>
           <w:ilvl w:val="0"/>
-          <w:numId w:val="1010"/>
+          <w:numId w:val="1020"/>
         </w:numPr>
         <w:pStyle w:val="Compact"/>
         <w:ind w:left="396" w:hanging="180"/>
@@ -8014,7 +8203,7 @@
       <w:pPr>
         <w:numPr>
           <w:ilvl w:val="0"/>
-          <w:numId w:val="1011"/>
+          <w:numId w:val="1021"/>
         </w:numPr>
         <w:pStyle w:val="Compact"/>
         <w:ind w:left="396" w:hanging="180"/>
@@ -8045,7 +8234,7 @@
       <w:pPr>
         <w:numPr>
           <w:ilvl w:val="0"/>
-          <w:numId w:val="1011"/>
+          <w:numId w:val="1021"/>
         </w:numPr>
         <w:pStyle w:val="Compact"/>
         <w:ind w:left="396" w:hanging="180"/>
@@ -8094,7 +8283,7 @@
       <w:pPr>
         <w:numPr>
           <w:ilvl w:val="0"/>
-          <w:numId w:val="1011"/>
+          <w:numId w:val="1021"/>
         </w:numPr>
         <w:pStyle w:val="Compact"/>
         <w:ind w:left="396" w:hanging="180"/>
@@ -9390,7 +9579,7 @@
       <w:pPr>
         <w:numPr>
           <w:ilvl w:val="0"/>
-          <w:numId w:val="1012"/>
+          <w:numId w:val="1022"/>
         </w:numPr>
         <w:pStyle w:val="Compact"/>
         <w:ind w:left="396" w:hanging="180"/>
@@ -9431,7 +9620,7 @@
       <w:pPr>
         <w:numPr>
           <w:ilvl w:val="0"/>
-          <w:numId w:val="1012"/>
+          <w:numId w:val="1022"/>
         </w:numPr>
         <w:pStyle w:val="Compact"/>
         <w:ind w:left="396" w:hanging="180"/>
@@ -9475,17 +9664,31 @@
       <w:r>
         <w:t xml:space="preserve">常见搭配：</w:t>
       </w:r>
-      <w:r>
-        <w:t xml:space="preserve"> </w:t>
-      </w:r>
-      <w:r>
-        <w:t xml:space="preserve">- suspect sb of (doing) sth 怀疑某人做了某事</w:t>
-      </w:r>
-      <w:r>
-        <w:t xml:space="preserve"> </w:t>
-      </w:r>
-      <w:r>
-        <w:t xml:space="preserve">- a suspected case 疑似病例</w:t>
+    </w:p>
+    <w:p>
+      <w:pPr>
+        <w:numPr>
+          <w:ilvl w:val="0"/>
+          <w:numId w:val="1023"/>
+        </w:numPr>
+        <w:pStyle w:val="Compact"/>
+        <w:ind w:left="396" w:hanging="180"/>
+      </w:pPr>
+      <w:r>
+        <w:t xml:space="preserve">suspect sb of (doing) sth 怀疑某人做了某事</w:t>
+      </w:r>
+    </w:p>
+    <w:p>
+      <w:pPr>
+        <w:numPr>
+          <w:ilvl w:val="0"/>
+          <w:numId w:val="1023"/>
+        </w:numPr>
+        <w:pStyle w:val="Compact"/>
+        <w:ind w:left="396" w:hanging="180"/>
+      </w:pPr>
+      <w:r>
+        <w:t xml:space="preserve">a suspected case 疑似病例</w:t>
       </w:r>
     </w:p>
     <w:p>
@@ -10991,7 +11194,7 @@
       <w:pPr>
         <w:numPr>
           <w:ilvl w:val="0"/>
-          <w:numId w:val="1013"/>
+          <w:numId w:val="1024"/>
         </w:numPr>
         <w:pStyle w:val="Compact"/>
         <w:ind w:left="396" w:hanging="180"/>
@@ -11015,7 +11218,7 @@
       <w:pPr>
         <w:numPr>
           <w:ilvl w:val="0"/>
-          <w:numId w:val="1013"/>
+          <w:numId w:val="1024"/>
         </w:numPr>
         <w:pStyle w:val="Compact"/>
         <w:ind w:left="396" w:hanging="180"/>
@@ -11039,7 +11242,7 @@
       <w:pPr>
         <w:numPr>
           <w:ilvl w:val="0"/>
-          <w:numId w:val="1013"/>
+          <w:numId w:val="1024"/>
         </w:numPr>
         <w:pStyle w:val="Compact"/>
         <w:ind w:left="396" w:hanging="180"/>
@@ -11063,7 +11266,7 @@
       <w:pPr>
         <w:numPr>
           <w:ilvl w:val="0"/>
-          <w:numId w:val="1013"/>
+          <w:numId w:val="1024"/>
         </w:numPr>
         <w:pStyle w:val="Compact"/>
         <w:ind w:left="396" w:hanging="180"/>
@@ -11087,7 +11290,7 @@
       <w:pPr>
         <w:numPr>
           <w:ilvl w:val="0"/>
-          <w:numId w:val="1013"/>
+          <w:numId w:val="1024"/>
         </w:numPr>
         <w:pStyle w:val="Compact"/>
         <w:ind w:left="396" w:hanging="180"/>
@@ -11111,7 +11314,7 @@
       <w:pPr>
         <w:numPr>
           <w:ilvl w:val="0"/>
-          <w:numId w:val="1013"/>
+          <w:numId w:val="1024"/>
         </w:numPr>
         <w:pStyle w:val="Compact"/>
         <w:ind w:left="396" w:hanging="180"/>
@@ -11135,7 +11338,7 @@
       <w:pPr>
         <w:numPr>
           <w:ilvl w:val="0"/>
-          <w:numId w:val="1013"/>
+          <w:numId w:val="1024"/>
         </w:numPr>
         <w:pStyle w:val="Compact"/>
         <w:ind w:left="396" w:hanging="180"/>
@@ -11159,7 +11362,7 @@
       <w:pPr>
         <w:numPr>
           <w:ilvl w:val="0"/>
-          <w:numId w:val="1013"/>
+          <w:numId w:val="1024"/>
         </w:numPr>
         <w:pStyle w:val="Compact"/>
         <w:ind w:left="396" w:hanging="180"/>
@@ -11532,23 +11735,44 @@
       <w:r>
         <w:t xml:space="preserve">常见搭配：</w:t>
       </w:r>
-      <w:r>
-        <w:t xml:space="preserve"> </w:t>
-      </w:r>
-      <w:r>
-        <w:t xml:space="preserve">- handle a problem / situation / crisis 处理问题/局面/危机</w:t>
-      </w:r>
-      <w:r>
-        <w:t xml:space="preserve"> </w:t>
-      </w:r>
-      <w:r>
-        <w:t xml:space="preserve">- handle pressure 承受压力</w:t>
-      </w:r>
-      <w:r>
-        <w:t xml:space="preserve"> </w:t>
-      </w:r>
-      <w:r>
-        <w:t xml:space="preserve">- handle with care 小心轻放</w:t>
+    </w:p>
+    <w:p>
+      <w:pPr>
+        <w:numPr>
+          <w:ilvl w:val="0"/>
+          <w:numId w:val="1025"/>
+        </w:numPr>
+        <w:pStyle w:val="Compact"/>
+        <w:ind w:left="396" w:hanging="180"/>
+      </w:pPr>
+      <w:r>
+        <w:t xml:space="preserve">handle a problem / situation / crisis 处理问题/局面/危机</w:t>
+      </w:r>
+    </w:p>
+    <w:p>
+      <w:pPr>
+        <w:numPr>
+          <w:ilvl w:val="0"/>
+          <w:numId w:val="1025"/>
+        </w:numPr>
+        <w:pStyle w:val="Compact"/>
+        <w:ind w:left="396" w:hanging="180"/>
+      </w:pPr>
+      <w:r>
+        <w:t xml:space="preserve">handle pressure 承受压力</w:t>
+      </w:r>
+    </w:p>
+    <w:p>
+      <w:pPr>
+        <w:numPr>
+          <w:ilvl w:val="0"/>
+          <w:numId w:val="1025"/>
+        </w:numPr>
+        <w:pStyle w:val="Compact"/>
+        <w:ind w:left="396" w:hanging="180"/>
+      </w:pPr>
+      <w:r>
+        <w:t xml:space="preserve">handle with care 小心轻放</w:t>
       </w:r>
     </w:p>
     <w:p>
@@ -12031,23 +12255,44 @@
         </w:rPr>
         <w:t xml:space="preserve">相关结构一起记：</w:t>
       </w:r>
-      <w:r>
-        <w:t xml:space="preserve"> </w:t>
-      </w:r>
-      <w:r>
-        <w:t xml:space="preserve">- have sb do sth → 让某人做（宾语是人，用动词原形）</w:t>
-      </w:r>
-      <w:r>
-        <w:t xml:space="preserve"> </w:t>
-      </w:r>
-      <w:r>
-        <w:t xml:space="preserve">- have sb doing sth → 让某人一直做</w:t>
-      </w:r>
-      <w:r>
-        <w:t xml:space="preserve"> </w:t>
-      </w:r>
-      <w:r>
-        <w:t xml:space="preserve">- get sth done → 与 have sth done 同义，更口语</w:t>
+    </w:p>
+    <w:p>
+      <w:pPr>
+        <w:numPr>
+          <w:ilvl w:val="0"/>
+          <w:numId w:val="1026"/>
+        </w:numPr>
+        <w:pStyle w:val="Compact"/>
+        <w:ind w:left="396" w:hanging="180"/>
+      </w:pPr>
+      <w:r>
+        <w:t xml:space="preserve">have sb do sth → 让某人做（宾语是人，用动词原形）</w:t>
+      </w:r>
+    </w:p>
+    <w:p>
+      <w:pPr>
+        <w:numPr>
+          <w:ilvl w:val="0"/>
+          <w:numId w:val="1026"/>
+        </w:numPr>
+        <w:pStyle w:val="Compact"/>
+        <w:ind w:left="396" w:hanging="180"/>
+      </w:pPr>
+      <w:r>
+        <w:t xml:space="preserve">have sb doing sth → 让某人一直做</w:t>
+      </w:r>
+    </w:p>
+    <w:p>
+      <w:pPr>
+        <w:numPr>
+          <w:ilvl w:val="0"/>
+          <w:numId w:val="1026"/>
+        </w:numPr>
+        <w:pStyle w:val="Compact"/>
+        <w:ind w:left="396" w:hanging="180"/>
+      </w:pPr>
+      <w:r>
+        <w:t xml:space="preserve">get sth done → 与 have sth done 同义，更口语</w:t>
       </w:r>
     </w:p>
     <w:p>
@@ -12211,17 +12456,31 @@
       <w:r>
         <w:t xml:space="preserve">词族：</w:t>
       </w:r>
-      <w:r>
-        <w:t xml:space="preserve"> </w:t>
-      </w:r>
-      <w:r>
-        <w:t xml:space="preserve">- intervene v. 干预；介入</w:t>
-      </w:r>
-      <w:r>
-        <w:t xml:space="preserve"> </w:t>
-      </w:r>
-      <w:r>
-        <w:t xml:space="preserve">- intervention n. 干预</w:t>
+    </w:p>
+    <w:p>
+      <w:pPr>
+        <w:numPr>
+          <w:ilvl w:val="0"/>
+          <w:numId w:val="1027"/>
+        </w:numPr>
+        <w:pStyle w:val="Compact"/>
+        <w:ind w:left="396" w:hanging="180"/>
+      </w:pPr>
+      <w:r>
+        <w:t xml:space="preserve">intervene v. 干预；介入</w:t>
+      </w:r>
+    </w:p>
+    <w:p>
+      <w:pPr>
+        <w:numPr>
+          <w:ilvl w:val="0"/>
+          <w:numId w:val="1027"/>
+        </w:numPr>
+        <w:pStyle w:val="Compact"/>
+        <w:ind w:left="396" w:hanging="180"/>
+      </w:pPr>
+      <w:r>
+        <w:t xml:space="preserve">intervention n. 干预</w:t>
       </w:r>
     </w:p>
     <w:p>
@@ -12231,29 +12490,57 @@
       <w:r>
         <w:t xml:space="preserve">常见搭配：</w:t>
       </w:r>
-      <w:r>
-        <w:t xml:space="preserve"> </w:t>
-      </w:r>
-      <w:r>
-        <w:t xml:space="preserve">- medical intervention 医疗干预</w:t>
-      </w:r>
-      <w:r>
-        <w:t xml:space="preserve"> </w:t>
-      </w:r>
-      <w:r>
-        <w:t xml:space="preserve">- government intervention 政府干预</w:t>
-      </w:r>
-      <w:r>
-        <w:t xml:space="preserve"> </w:t>
-      </w:r>
-      <w:r>
-        <w:t xml:space="preserve">- military intervention 军事干预</w:t>
-      </w:r>
-      <w:r>
-        <w:t xml:space="preserve"> </w:t>
-      </w:r>
-      <w:r>
-        <w:t xml:space="preserve">- timely intervention 及时干预</w:t>
+    </w:p>
+    <w:p>
+      <w:pPr>
+        <w:numPr>
+          <w:ilvl w:val="0"/>
+          <w:numId w:val="1028"/>
+        </w:numPr>
+        <w:pStyle w:val="Compact"/>
+        <w:ind w:left="396" w:hanging="180"/>
+      </w:pPr>
+      <w:r>
+        <w:t xml:space="preserve">medical intervention 医疗干预</w:t>
+      </w:r>
+    </w:p>
+    <w:p>
+      <w:pPr>
+        <w:numPr>
+          <w:ilvl w:val="0"/>
+          <w:numId w:val="1028"/>
+        </w:numPr>
+        <w:pStyle w:val="Compact"/>
+        <w:ind w:left="396" w:hanging="180"/>
+      </w:pPr>
+      <w:r>
+        <w:t xml:space="preserve">government intervention 政府干预</w:t>
+      </w:r>
+    </w:p>
+    <w:p>
+      <w:pPr>
+        <w:numPr>
+          <w:ilvl w:val="0"/>
+          <w:numId w:val="1028"/>
+        </w:numPr>
+        <w:pStyle w:val="Compact"/>
+        <w:ind w:left="396" w:hanging="180"/>
+      </w:pPr>
+      <w:r>
+        <w:t xml:space="preserve">military intervention 军事干预</w:t>
+      </w:r>
+    </w:p>
+    <w:p>
+      <w:pPr>
+        <w:numPr>
+          <w:ilvl w:val="0"/>
+          <w:numId w:val="1028"/>
+        </w:numPr>
+        <w:pStyle w:val="Compact"/>
+        <w:ind w:left="396" w:hanging="180"/>
+      </w:pPr>
+      <w:r>
+        <w:t xml:space="preserve">timely intervention 及时干预</w:t>
       </w:r>
     </w:p>
     <w:p>
@@ -12524,7 +12811,7 @@
       <w:pPr>
         <w:numPr>
           <w:ilvl w:val="0"/>
-          <w:numId w:val="1014"/>
+          <w:numId w:val="1029"/>
         </w:numPr>
         <w:pStyle w:val="Compact"/>
         <w:ind w:left="396" w:hanging="180"/>
@@ -12546,7 +12833,7 @@
       <w:pPr>
         <w:numPr>
           <w:ilvl w:val="0"/>
-          <w:numId w:val="1014"/>
+          <w:numId w:val="1029"/>
         </w:numPr>
         <w:pStyle w:val="Compact"/>
         <w:ind w:left="396" w:hanging="180"/>
@@ -12582,132 +12869,85 @@
       <w:r>
         <w:t xml:space="preserve">类似表达：</w:t>
       </w:r>
-      <w:r>
-        <w:t xml:space="preserve"> </w:t>
-      </w:r>
-      <w:r>
-        <w:t xml:space="preserve">- The news stopped her in her tracks. 这个消息让她愣在原地。</w:t>
-      </w:r>
-    </w:p>
-    <w:p>
-      <w:pPr>
-        <w:pStyle w:val="BlockText"/>
-      </w:pPr>
-      <w:r>
-        <w:rPr>
-          <w:rFonts w:eastAsia="Noto Serif CJK SC SemiBold"/>
-          <w:b/>
-          <w:color w:val="1E293B"/>
-        </w:rPr>
-        <w:t xml:space="preserve">※ 高考迁移：▲ 只读不写</w:t>
-      </w:r>
-    </w:p>
-    <w:p>
-      <w:pPr>
-        <w:pStyle w:val="BlockText"/>
-      </w:pPr>
-      <w:r>
-        <w:t xml:space="preserve">这是</w:t>
-      </w:r>
-      <w:r>
-        <w:rPr>
-          <w:rFonts w:eastAsia="Noto Serif CJK SC SemiBold"/>
-          <w:b/>
-          <w:color w:val="1E293B"/>
-        </w:rPr>
-        <w:t xml:space="preserve">文学化的习语</w:t>
-      </w:r>
-      <w:r>
-        <w:t xml:space="preserve">，带有明显的修辞色彩，不适合高考议论文的正式语域。</w:t>
-      </w:r>
-      <w:r>
-        <w:rPr>
-          <w:rFonts w:eastAsia="Noto Serif CJK SC SemiBold"/>
-          <w:b/>
-          <w:color w:val="1E293B"/>
-        </w:rPr>
-        <w:t xml:space="preserve">读懂即可，不要硬塞进作文。</w:t>
-      </w:r>
-    </w:p>
-    <w:p>
-      <w:pPr>
-        <w:pStyle w:val="BlockText"/>
-      </w:pPr>
-      <w:r>
-        <w:t xml:space="preserve">高考写作中表达</w:t>
-      </w:r>
-      <w:r>
-        <w:t xml:space="preserve">“</w:t>
-      </w:r>
-      <w:r>
-        <w:t xml:space="preserve">有效阻止</w:t>
-      </w:r>
-      <w:r>
-        <w:t xml:space="preserve">”</w:t>
-      </w:r>
-      <w:r>
-        <w:t xml:space="preserve">，推荐更稳妥的说法：</w:t>
-      </w:r>
     </w:p>
     <w:p>
       <w:pPr>
         <w:numPr>
           <w:ilvl w:val="0"/>
-          <w:numId w:val="1015"/>
+          <w:numId w:val="1030"/>
         </w:numPr>
         <w:pStyle w:val="Compact"/>
         <w:ind w:left="396" w:hanging="180"/>
       </w:pPr>
       <w:r>
-        <w:rPr>
-          <w:rFonts w:eastAsia="Noto Serif CJK SC SemiBold"/>
-          <w:b/>
-          <w:color w:val="1E293B"/>
-        </w:rPr>
-        <w:t xml:space="preserve">bring … under control</w:t>
-      </w:r>
-      <w:r>
-        <w:t xml:space="preserve"> </w:t>
-      </w:r>
-      <w:r>
-        <w:t xml:space="preserve">使……得到控制</w:t>
-      </w:r>
-      <w:r>
-        <w:t xml:space="preserve"> </w:t>
-      </w:r>
-      <w:r>
-        <w:rPr>
-          <w:i/>
-        </w:rPr>
-        <w:t xml:space="preserve">The outbreak was quickly</w:t>
-      </w:r>
-      <w:r>
-        <w:rPr>
-          <w:i/>
-        </w:rPr>
-        <w:t xml:space="preserve"> </w:t>
-      </w:r>
-      <w:r>
-        <w:rPr>
-          <w:rFonts w:eastAsia="Noto Serif CJK SC SemiBold"/>
-          <w:b/>
-          <w:i/>
-          <w:color w:val="1E293B"/>
-        </w:rPr>
-        <w:t xml:space="preserve">brought under control</w:t>
-      </w:r>
-      <w:r>
-        <w:rPr>
-          <w:i/>
-        </w:rPr>
-        <w:t xml:space="preserve">.</w:t>
+        <w:t xml:space="preserve">The news stopped her in her tracks. 这个消息让她愣在原地。</w:t>
+      </w:r>
+    </w:p>
+    <w:p>
+      <w:pPr>
+        <w:pStyle w:val="BlockText"/>
+      </w:pPr>
+      <w:r>
+        <w:rPr>
+          <w:rFonts w:eastAsia="Noto Serif CJK SC SemiBold"/>
+          <w:b/>
+          <w:color w:val="1E293B"/>
+        </w:rPr>
+        <w:t xml:space="preserve">※ 高考迁移：▲ 只读不写</w:t>
+      </w:r>
+    </w:p>
+    <w:p>
+      <w:pPr>
+        <w:pStyle w:val="BlockText"/>
+      </w:pPr>
+      <w:r>
+        <w:t xml:space="preserve">这是</w:t>
+      </w:r>
+      <w:r>
+        <w:rPr>
+          <w:rFonts w:eastAsia="Noto Serif CJK SC SemiBold"/>
+          <w:b/>
+          <w:color w:val="1E293B"/>
+        </w:rPr>
+        <w:t xml:space="preserve">文学化的习语</w:t>
+      </w:r>
+      <w:r>
+        <w:t xml:space="preserve">，带有明显的修辞色彩，不适合高考议论文的正式语域。</w:t>
+      </w:r>
+      <w:r>
+        <w:rPr>
+          <w:rFonts w:eastAsia="Noto Serif CJK SC SemiBold"/>
+          <w:b/>
+          <w:color w:val="1E293B"/>
+        </w:rPr>
+        <w:t xml:space="preserve">读懂即可，不要硬塞进作文。</w:t>
+      </w:r>
+    </w:p>
+    <w:p>
+      <w:pPr>
+        <w:pStyle w:val="BlockText"/>
+      </w:pPr>
+      <w:r>
+        <w:t xml:space="preserve">高考写作中表达</w:t>
+      </w:r>
+      <w:r>
+        <w:t xml:space="preserve">“</w:t>
+      </w:r>
+      <w:r>
+        <w:t xml:space="preserve">有效阻止</w:t>
+      </w:r>
+      <w:r>
+        <w:t xml:space="preserve">”</w:t>
+      </w:r>
+      <w:r>
+        <w:t xml:space="preserve">，推荐更稳妥的说法：</w:t>
       </w:r>
     </w:p>
     <w:p>
       <w:pPr>
         <w:numPr>
           <w:ilvl w:val="0"/>
-          <w:numId w:val="1015"/>
+          <w:numId w:val="1031"/>
         </w:numPr>
         <w:pStyle w:val="Compact"/>
         <w:ind w:left="396" w:hanging="180"/>
@@ -12718,13 +12958,13 @@
           <w:b/>
           <w:color w:val="1E293B"/>
         </w:rPr>
-        <w:t xml:space="preserve">put an end to …</w:t>
-      </w:r>
-      <w:r>
-        <w:t xml:space="preserve"> </w:t>
-      </w:r>
-      <w:r>
-        <w:t xml:space="preserve">终结……</w:t>
+        <w:t xml:space="preserve">bring … under control</w:t>
+      </w:r>
+      <w:r>
+        <w:t xml:space="preserve"> </w:t>
+      </w:r>
+      <w:r>
+        <w:t xml:space="preserve">使……得到控制</w:t>
       </w:r>
       <w:r>
         <w:t xml:space="preserve"> </w:t>
@@ -12733,7 +12973,7 @@
         <w:rPr>
           <w:i/>
         </w:rPr>
-        <w:t xml:space="preserve">His discovery</w:t>
+        <w:t xml:space="preserve">The outbreak was quickly</w:t>
       </w:r>
       <w:r>
         <w:rPr>
@@ -12748,26 +12988,20 @@
           <w:i/>
           <w:color w:val="1E293B"/>
         </w:rPr>
-        <w:t xml:space="preserve">put an end to</w:t>
+        <w:t xml:space="preserve">brought under control</w:t>
       </w:r>
       <w:r>
         <w:rPr>
           <w:i/>
         </w:rPr>
-        <w:t xml:space="preserve"> </w:t>
-      </w:r>
-      <w:r>
-        <w:rPr>
-          <w:i/>
-        </w:rPr>
-        <w:t xml:space="preserve">the spread of the disease.</w:t>
+        <w:t xml:space="preserve">.</w:t>
       </w:r>
     </w:p>
     <w:p>
       <w:pPr>
         <w:numPr>
           <w:ilvl w:val="0"/>
-          <w:numId w:val="1015"/>
+          <w:numId w:val="1031"/>
         </w:numPr>
         <w:pStyle w:val="Compact"/>
         <w:ind w:left="396" w:hanging="180"/>
@@ -12778,20 +13012,80 @@
           <w:b/>
           <w:color w:val="1E293B"/>
         </w:rPr>
-        <w:t xml:space="preserve">effectively prevent …</w:t>
-      </w:r>
-      <w:r>
-        <w:t xml:space="preserve"> </w:t>
-      </w:r>
-      <w:r>
-        <w:t xml:space="preserve">有效阻止……</w:t>
+        <w:t xml:space="preserve">put an end to …</w:t>
+      </w:r>
+      <w:r>
+        <w:t xml:space="preserve"> </w:t>
+      </w:r>
+      <w:r>
+        <w:t xml:space="preserve">终结……</w:t>
+      </w:r>
+      <w:r>
+        <w:t xml:space="preserve"> </w:t>
+      </w:r>
+      <w:r>
+        <w:rPr>
+          <w:i/>
+        </w:rPr>
+        <w:t xml:space="preserve">His discovery</w:t>
+      </w:r>
+      <w:r>
+        <w:rPr>
+          <w:i/>
+        </w:rPr>
+        <w:t xml:space="preserve"> </w:t>
+      </w:r>
+      <w:r>
+        <w:rPr>
+          <w:rFonts w:eastAsia="Noto Serif CJK SC SemiBold"/>
+          <w:b/>
+          <w:i/>
+          <w:color w:val="1E293B"/>
+        </w:rPr>
+        <w:t xml:space="preserve">put an end to</w:t>
+      </w:r>
+      <w:r>
+        <w:rPr>
+          <w:i/>
+        </w:rPr>
+        <w:t xml:space="preserve"> </w:t>
+      </w:r>
+      <w:r>
+        <w:rPr>
+          <w:i/>
+        </w:rPr>
+        <w:t xml:space="preserve">the spread of the disease.</w:t>
       </w:r>
     </w:p>
     <w:p>
       <w:pPr>
         <w:numPr>
           <w:ilvl w:val="0"/>
-          <w:numId w:val="1015"/>
+          <w:numId w:val="1031"/>
+        </w:numPr>
+        <w:pStyle w:val="Compact"/>
+        <w:ind w:left="396" w:hanging="180"/>
+      </w:pPr>
+      <w:r>
+        <w:rPr>
+          <w:rFonts w:eastAsia="Noto Serif CJK SC SemiBold"/>
+          <w:b/>
+          <w:color w:val="1E293B"/>
+        </w:rPr>
+        <w:t xml:space="preserve">effectively prevent …</w:t>
+      </w:r>
+      <w:r>
+        <w:t xml:space="preserve"> </w:t>
+      </w:r>
+      <w:r>
+        <w:t xml:space="preserve">有效阻止……</w:t>
+      </w:r>
+    </w:p>
+    <w:p>
+      <w:pPr>
+        <w:numPr>
+          <w:ilvl w:val="0"/>
+          <w:numId w:val="1031"/>
         </w:numPr>
         <w:pStyle w:val="Compact"/>
         <w:ind w:left="396" w:hanging="180"/>
@@ -13993,7 +14287,7 @@
       <w:pPr>
         <w:numPr>
           <w:ilvl w:val="0"/>
-          <w:numId w:val="1016"/>
+          <w:numId w:val="1032"/>
         </w:numPr>
         <w:pStyle w:val="Compact"/>
         <w:ind w:left="396" w:hanging="180"/>
@@ -14028,7 +14322,7 @@
       <w:pPr>
         <w:numPr>
           <w:ilvl w:val="0"/>
-          <w:numId w:val="1016"/>
+          <w:numId w:val="1032"/>
         </w:numPr>
         <w:pStyle w:val="Compact"/>
         <w:ind w:left="396" w:hanging="180"/>
@@ -14052,7 +14346,7 @@
       <w:pPr>
         <w:numPr>
           <w:ilvl w:val="0"/>
-          <w:numId w:val="1016"/>
+          <w:numId w:val="1032"/>
         </w:numPr>
         <w:pStyle w:val="Compact"/>
         <w:ind w:left="396" w:hanging="180"/>
@@ -14076,7 +14370,7 @@
       <w:pPr>
         <w:numPr>
           <w:ilvl w:val="0"/>
-          <w:numId w:val="1016"/>
+          <w:numId w:val="1032"/>
         </w:numPr>
         <w:pStyle w:val="Compact"/>
         <w:ind w:left="396" w:hanging="180"/>
@@ -14100,7 +14394,7 @@
       <w:pPr>
         <w:numPr>
           <w:ilvl w:val="0"/>
-          <w:numId w:val="1016"/>
+          <w:numId w:val="1032"/>
         </w:numPr>
         <w:pStyle w:val="Compact"/>
         <w:ind w:left="396" w:hanging="180"/>
@@ -14124,7 +14418,7 @@
       <w:pPr>
         <w:numPr>
           <w:ilvl w:val="0"/>
-          <w:numId w:val="1016"/>
+          <w:numId w:val="1032"/>
         </w:numPr>
         <w:pStyle w:val="Compact"/>
         <w:ind w:left="396" w:hanging="180"/>
@@ -14578,29 +14872,57 @@
       <w:r>
         <w:t xml:space="preserve">常见搭配：</w:t>
       </w:r>
-      <w:r>
-        <w:t xml:space="preserve"> </w:t>
-      </w:r>
-      <w:r>
-        <w:t xml:space="preserve">- industrial / household / nuclear waste 工业/生活/核废料</w:t>
-      </w:r>
-      <w:r>
-        <w:t xml:space="preserve"> </w:t>
-      </w:r>
-      <w:r>
-        <w:t xml:space="preserve">- waste disposal 废物处理</w:t>
-      </w:r>
-      <w:r>
-        <w:t xml:space="preserve"> </w:t>
-      </w:r>
-      <w:r>
-        <w:t xml:space="preserve">- waste water 废水；污水</w:t>
-      </w:r>
-      <w:r>
-        <w:t xml:space="preserve"> </w:t>
-      </w:r>
-      <w:r>
-        <w:t xml:space="preserve">- a waste of time / money / energy 浪费时间/金钱/精力</w:t>
+    </w:p>
+    <w:p>
+      <w:pPr>
+        <w:numPr>
+          <w:ilvl w:val="0"/>
+          <w:numId w:val="1033"/>
+        </w:numPr>
+        <w:pStyle w:val="Compact"/>
+        <w:ind w:left="396" w:hanging="180"/>
+      </w:pPr>
+      <w:r>
+        <w:t xml:space="preserve">industrial / household / nuclear waste 工业/生活/核废料</w:t>
+      </w:r>
+    </w:p>
+    <w:p>
+      <w:pPr>
+        <w:numPr>
+          <w:ilvl w:val="0"/>
+          <w:numId w:val="1033"/>
+        </w:numPr>
+        <w:pStyle w:val="Compact"/>
+        <w:ind w:left="396" w:hanging="180"/>
+      </w:pPr>
+      <w:r>
+        <w:t xml:space="preserve">waste disposal 废物处理</w:t>
+      </w:r>
+    </w:p>
+    <w:p>
+      <w:pPr>
+        <w:numPr>
+          <w:ilvl w:val="0"/>
+          <w:numId w:val="1033"/>
+        </w:numPr>
+        <w:pStyle w:val="Compact"/>
+        <w:ind w:left="396" w:hanging="180"/>
+      </w:pPr>
+      <w:r>
+        <w:t xml:space="preserve">waste water 废水；污水</w:t>
+      </w:r>
+    </w:p>
+    <w:p>
+      <w:pPr>
+        <w:numPr>
+          <w:ilvl w:val="0"/>
+          <w:numId w:val="1033"/>
+        </w:numPr>
+        <w:pStyle w:val="Compact"/>
+        <w:ind w:left="396" w:hanging="180"/>
+      </w:pPr>
+      <w:r>
+        <w:t xml:space="preserve">a waste of time / money / energy 浪费时间/金钱/精力</w:t>
       </w:r>
     </w:p>
     <w:p>
@@ -15056,23 +15378,44 @@
       <w:r>
         <w:t xml:space="preserve">常见搭配：</w:t>
       </w:r>
-      <w:r>
-        <w:t xml:space="preserve"> </w:t>
-      </w:r>
-      <w:r>
-        <w:t xml:space="preserve">- raw materials 原材料</w:t>
-      </w:r>
-      <w:r>
-        <w:t xml:space="preserve"> </w:t>
-      </w:r>
-      <w:r>
-        <w:t xml:space="preserve">- raw data 原始数据</w:t>
-      </w:r>
-      <w:r>
-        <w:t xml:space="preserve"> </w:t>
-      </w:r>
-      <w:r>
-        <w:t xml:space="preserve">- eat sth raw 生吃</w:t>
+    </w:p>
+    <w:p>
+      <w:pPr>
+        <w:numPr>
+          <w:ilvl w:val="0"/>
+          <w:numId w:val="1034"/>
+        </w:numPr>
+        <w:pStyle w:val="Compact"/>
+        <w:ind w:left="396" w:hanging="180"/>
+      </w:pPr>
+      <w:r>
+        <w:t xml:space="preserve">raw materials 原材料</w:t>
+      </w:r>
+    </w:p>
+    <w:p>
+      <w:pPr>
+        <w:numPr>
+          <w:ilvl w:val="0"/>
+          <w:numId w:val="1034"/>
+        </w:numPr>
+        <w:pStyle w:val="Compact"/>
+        <w:ind w:left="396" w:hanging="180"/>
+      </w:pPr>
+      <w:r>
+        <w:t xml:space="preserve">raw data 原始数据</w:t>
+      </w:r>
+    </w:p>
+    <w:p>
+      <w:pPr>
+        <w:numPr>
+          <w:ilvl w:val="0"/>
+          <w:numId w:val="1034"/>
+        </w:numPr>
+        <w:pStyle w:val="Compact"/>
+        <w:ind w:left="396" w:hanging="180"/>
+      </w:pPr>
+      <w:r>
+        <w:t xml:space="preserve">eat sth raw 生吃</w:t>
       </w:r>
     </w:p>
     <w:p>
@@ -15251,7 +15594,7 @@
       <w:pPr>
         <w:numPr>
           <w:ilvl w:val="0"/>
-          <w:numId w:val="1017"/>
+          <w:numId w:val="1035"/>
         </w:numPr>
         <w:pStyle w:val="Compact"/>
         <w:ind w:left="396" w:hanging="180"/>
@@ -15264,7 +15607,7 @@
       <w:pPr>
         <w:numPr>
           <w:ilvl w:val="0"/>
-          <w:numId w:val="1017"/>
+          <w:numId w:val="1035"/>
         </w:numPr>
         <w:pStyle w:val="Compact"/>
         <w:ind w:left="396" w:hanging="180"/>
@@ -15277,7 +15620,7 @@
       <w:pPr>
         <w:numPr>
           <w:ilvl w:val="0"/>
-          <w:numId w:val="1017"/>
+          <w:numId w:val="1035"/>
         </w:numPr>
         <w:pStyle w:val="Compact"/>
         <w:ind w:left="396" w:hanging="180"/>
@@ -15290,7 +15633,7 @@
       <w:pPr>
         <w:numPr>
           <w:ilvl w:val="0"/>
-          <w:numId w:val="1017"/>
+          <w:numId w:val="1035"/>
         </w:numPr>
         <w:pStyle w:val="Compact"/>
         <w:ind w:left="396" w:hanging="180"/>
@@ -15805,7 +16148,7 @@
       <w:pPr>
         <w:numPr>
           <w:ilvl w:val="0"/>
-          <w:numId w:val="1018"/>
+          <w:numId w:val="1036"/>
         </w:numPr>
         <w:pStyle w:val="Compact"/>
         <w:ind w:left="396" w:hanging="180"/>
@@ -15829,7 +16172,7 @@
       <w:pPr>
         <w:numPr>
           <w:ilvl w:val="0"/>
-          <w:numId w:val="1018"/>
+          <w:numId w:val="1036"/>
         </w:numPr>
         <w:pStyle w:val="Compact"/>
         <w:ind w:left="396" w:hanging="180"/>
@@ -15853,7 +16196,7 @@
       <w:pPr>
         <w:numPr>
           <w:ilvl w:val="0"/>
-          <w:numId w:val="1018"/>
+          <w:numId w:val="1036"/>
         </w:numPr>
         <w:pStyle w:val="Compact"/>
         <w:ind w:left="396" w:hanging="180"/>
@@ -15877,7 +16220,7 @@
       <w:pPr>
         <w:numPr>
           <w:ilvl w:val="0"/>
-          <w:numId w:val="1018"/>
+          <w:numId w:val="1036"/>
         </w:numPr>
         <w:pStyle w:val="Compact"/>
         <w:ind w:left="396" w:hanging="180"/>
@@ -15901,7 +16244,7 @@
       <w:pPr>
         <w:numPr>
           <w:ilvl w:val="0"/>
-          <w:numId w:val="1018"/>
+          <w:numId w:val="1036"/>
         </w:numPr>
         <w:pStyle w:val="Compact"/>
         <w:ind w:left="396" w:hanging="180"/>
@@ -15925,7 +16268,7 @@
       <w:pPr>
         <w:numPr>
           <w:ilvl w:val="0"/>
-          <w:numId w:val="1018"/>
+          <w:numId w:val="1036"/>
         </w:numPr>
         <w:pStyle w:val="Compact"/>
         <w:ind w:left="396" w:hanging="180"/>
@@ -15949,7 +16292,7 @@
       <w:pPr>
         <w:numPr>
           <w:ilvl w:val="0"/>
-          <w:numId w:val="1018"/>
+          <w:numId w:val="1036"/>
         </w:numPr>
         <w:pStyle w:val="Compact"/>
         <w:ind w:left="396" w:hanging="180"/>
@@ -17528,7 +17871,7 @@
       <w:pPr>
         <w:numPr>
           <w:ilvl w:val="0"/>
-          <w:numId w:val="1019"/>
+          <w:numId w:val="1037"/>
         </w:numPr>
         <w:pStyle w:val="Compact"/>
         <w:ind w:left="396" w:hanging="180"/>
@@ -17552,7 +17895,7 @@
       <w:pPr>
         <w:numPr>
           <w:ilvl w:val="0"/>
-          <w:numId w:val="1019"/>
+          <w:numId w:val="1037"/>
         </w:numPr>
         <w:pStyle w:val="Compact"/>
         <w:ind w:left="396" w:hanging="180"/>
@@ -17611,7 +17954,7 @@
       <w:pPr>
         <w:numPr>
           <w:ilvl w:val="0"/>
-          <w:numId w:val="1019"/>
+          <w:numId w:val="1037"/>
         </w:numPr>
         <w:pStyle w:val="Compact"/>
         <w:ind w:left="396" w:hanging="180"/>
@@ -17646,7 +17989,7 @@
       <w:pPr>
         <w:numPr>
           <w:ilvl w:val="0"/>
-          <w:numId w:val="1019"/>
+          <w:numId w:val="1037"/>
         </w:numPr>
         <w:pStyle w:val="Compact"/>
         <w:ind w:left="396" w:hanging="180"/>
@@ -17670,7 +18013,7 @@
       <w:pPr>
         <w:numPr>
           <w:ilvl w:val="0"/>
-          <w:numId w:val="1019"/>
+          <w:numId w:val="1037"/>
         </w:numPr>
         <w:pStyle w:val="Compact"/>
         <w:ind w:left="396" w:hanging="180"/>
@@ -17694,7 +18037,7 @@
       <w:pPr>
         <w:numPr>
           <w:ilvl w:val="0"/>
-          <w:numId w:val="1019"/>
+          <w:numId w:val="1037"/>
         </w:numPr>
         <w:pStyle w:val="Compact"/>
         <w:ind w:left="396" w:hanging="180"/>
@@ -17718,7 +18061,7 @@
       <w:pPr>
         <w:numPr>
           <w:ilvl w:val="0"/>
-          <w:numId w:val="1019"/>
+          <w:numId w:val="1037"/>
         </w:numPr>
         <w:pStyle w:val="Compact"/>
         <w:ind w:left="396" w:hanging="180"/>
@@ -18611,7 +18954,7 @@
       <w:pPr>
         <w:numPr>
           <w:ilvl w:val="0"/>
-          <w:numId w:val="1020"/>
+          <w:numId w:val="1038"/>
         </w:numPr>
         <w:pStyle w:val="Compact"/>
         <w:ind w:left="396" w:hanging="180"/>
@@ -18647,7 +18990,7 @@
       <w:pPr>
         <w:numPr>
           <w:ilvl w:val="0"/>
-          <w:numId w:val="1020"/>
+          <w:numId w:val="1038"/>
         </w:numPr>
         <w:pStyle w:val="Compact"/>
         <w:ind w:left="396" w:hanging="180"/>
@@ -18683,7 +19026,7 @@
       <w:pPr>
         <w:numPr>
           <w:ilvl w:val="0"/>
-          <w:numId w:val="1020"/>
+          <w:numId w:val="1038"/>
         </w:numPr>
         <w:pStyle w:val="Compact"/>
         <w:ind w:left="396" w:hanging="180"/>
@@ -18780,87 +19123,94 @@
       <w:r>
         <w:t xml:space="preserve">（经历）</w:t>
       </w:r>
-      <w:r>
-        <w:t xml:space="preserve"> </w:t>
-      </w:r>
-      <w:r>
-        <w:t xml:space="preserve">- The 19th century</w:t>
-      </w:r>
-      <w:r>
-        <w:t xml:space="preserve"> </w:t>
-      </w:r>
-      <w:r>
-        <w:rPr>
-          <w:rFonts w:eastAsia="Noto Serif CJK SC SemiBold"/>
-          <w:b/>
-          <w:color w:val="1E293B"/>
-        </w:rPr>
-        <w:t xml:space="preserve">witnessed</w:t>
-      </w:r>
-      <w:r>
-        <w:t xml:space="preserve"> </w:t>
-      </w:r>
-      <w:r>
-        <w:t xml:space="preserve">the rise of modern science.</w:t>
-      </w:r>
-    </w:p>
-    <w:p>
-      <w:pPr>
-        <w:pStyle w:val="BlockText"/>
-      </w:pPr>
-      <w:r>
-        <w:rPr>
-          <w:rFonts w:eastAsia="Noto Serif CJK SC SemiBold"/>
-          <w:b/>
-          <w:color w:val="1E293B"/>
-        </w:rPr>
-        <w:t xml:space="preserve">※ 高考迁移：✓✓✓ 强烈推荐。</w:t>
-      </w:r>
-    </w:p>
-    <w:p>
-      <w:pPr>
-        <w:pStyle w:val="BlockText"/>
-      </w:pPr>
-      <w:r>
-        <w:t xml:space="preserve">这个句型能让作文瞬间脱离</w:t>
-      </w:r>
-      <w:r>
-        <w:t xml:space="preserve">“</w:t>
-      </w:r>
-      <w:r>
-        <w:t xml:space="preserve">中式英语</w:t>
-      </w:r>
-      <w:r>
-        <w:t xml:space="preserve">”</w:t>
-      </w:r>
-      <w:r>
-        <w:t xml:space="preserve">的平铺直叙：</w:t>
-      </w:r>
     </w:p>
     <w:p>
       <w:pPr>
         <w:numPr>
           <w:ilvl w:val="0"/>
-          <w:numId w:val="1021"/>
+          <w:numId w:val="1039"/>
         </w:numPr>
         <w:pStyle w:val="Compact"/>
         <w:ind w:left="396" w:hanging="180"/>
       </w:pPr>
       <w:r>
-        <w:t xml:space="preserve">普通：</w:t>
-      </w:r>
-      <w:r>
-        <w:rPr>
-          <w:rStyle w:val="VerbatimChar"/>
-        </w:rPr>
-        <w:t xml:space="preserve">In the past ten years, online learning has developed rapidly.</w:t>
+        <w:t xml:space="preserve">The 19th century</w:t>
+      </w:r>
+      <w:r>
+        <w:t xml:space="preserve"> </w:t>
+      </w:r>
+      <w:r>
+        <w:rPr>
+          <w:rFonts w:eastAsia="Noto Serif CJK SC SemiBold"/>
+          <w:b/>
+          <w:color w:val="1E293B"/>
+        </w:rPr>
+        <w:t xml:space="preserve">witnessed</w:t>
+      </w:r>
+      <w:r>
+        <w:t xml:space="preserve"> </w:t>
+      </w:r>
+      <w:r>
+        <w:t xml:space="preserve">the rise of modern science.</w:t>
+      </w:r>
+    </w:p>
+    <w:p>
+      <w:pPr>
+        <w:pStyle w:val="BlockText"/>
+      </w:pPr>
+      <w:r>
+        <w:rPr>
+          <w:rFonts w:eastAsia="Noto Serif CJK SC SemiBold"/>
+          <w:b/>
+          <w:color w:val="1E293B"/>
+        </w:rPr>
+        <w:t xml:space="preserve">※ 高考迁移：✓✓✓ 强烈推荐。</w:t>
+      </w:r>
+    </w:p>
+    <w:p>
+      <w:pPr>
+        <w:pStyle w:val="BlockText"/>
+      </w:pPr>
+      <w:r>
+        <w:t xml:space="preserve">这个句型能让作文瞬间脱离</w:t>
+      </w:r>
+      <w:r>
+        <w:t xml:space="preserve">“</w:t>
+      </w:r>
+      <w:r>
+        <w:t xml:space="preserve">中式英语</w:t>
+      </w:r>
+      <w:r>
+        <w:t xml:space="preserve">”</w:t>
+      </w:r>
+      <w:r>
+        <w:t xml:space="preserve">的平铺直叙：</w:t>
       </w:r>
     </w:p>
     <w:p>
       <w:pPr>
         <w:numPr>
           <w:ilvl w:val="0"/>
-          <w:numId w:val="1021"/>
+          <w:numId w:val="1040"/>
+        </w:numPr>
+        <w:pStyle w:val="Compact"/>
+        <w:ind w:left="396" w:hanging="180"/>
+      </w:pPr>
+      <w:r>
+        <w:t xml:space="preserve">普通：</w:t>
+      </w:r>
+      <w:r>
+        <w:rPr>
+          <w:rStyle w:val="VerbatimChar"/>
+        </w:rPr>
+        <w:t xml:space="preserve">In the past ten years, online learning has developed rapidly.</w:t>
+      </w:r>
+    </w:p>
+    <w:p>
+      <w:pPr>
+        <w:numPr>
+          <w:ilvl w:val="0"/>
+          <w:numId w:val="1040"/>
         </w:numPr>
         <w:pStyle w:val="Compact"/>
         <w:ind w:left="396" w:hanging="180"/>
@@ -19050,29 +19400,57 @@
       <w:r>
         <w:t xml:space="preserve">常见搭配：</w:t>
       </w:r>
-      <w:r>
-        <w:t xml:space="preserve"> </w:t>
-      </w:r>
-      <w:r>
-        <w:t xml:space="preserve">- a substantial increase / decrease 大幅上升/下降</w:t>
-      </w:r>
-      <w:r>
-        <w:t xml:space="preserve"> </w:t>
-      </w:r>
-      <w:r>
-        <w:t xml:space="preserve">- substantial evidence 大量证据</w:t>
-      </w:r>
-      <w:r>
-        <w:t xml:space="preserve"> </w:t>
-      </w:r>
-      <w:r>
-        <w:t xml:space="preserve">- substantial progress 实质性进展</w:t>
-      </w:r>
-      <w:r>
-        <w:t xml:space="preserve"> </w:t>
-      </w:r>
-      <w:r>
-        <w:t xml:space="preserve">- a substantial amount of … 大量的……</w:t>
+    </w:p>
+    <w:p>
+      <w:pPr>
+        <w:numPr>
+          <w:ilvl w:val="0"/>
+          <w:numId w:val="1041"/>
+        </w:numPr>
+        <w:pStyle w:val="Compact"/>
+        <w:ind w:left="396" w:hanging="180"/>
+      </w:pPr>
+      <w:r>
+        <w:t xml:space="preserve">a substantial increase / decrease 大幅上升/下降</w:t>
+      </w:r>
+    </w:p>
+    <w:p>
+      <w:pPr>
+        <w:numPr>
+          <w:ilvl w:val="0"/>
+          <w:numId w:val="1041"/>
+        </w:numPr>
+        <w:pStyle w:val="Compact"/>
+        <w:ind w:left="396" w:hanging="180"/>
+      </w:pPr>
+      <w:r>
+        <w:t xml:space="preserve">substantial evidence 大量证据</w:t>
+      </w:r>
+    </w:p>
+    <w:p>
+      <w:pPr>
+        <w:numPr>
+          <w:ilvl w:val="0"/>
+          <w:numId w:val="1041"/>
+        </w:numPr>
+        <w:pStyle w:val="Compact"/>
+        <w:ind w:left="396" w:hanging="180"/>
+      </w:pPr>
+      <w:r>
+        <w:t xml:space="preserve">substantial progress 实质性进展</w:t>
+      </w:r>
+    </w:p>
+    <w:p>
+      <w:pPr>
+        <w:numPr>
+          <w:ilvl w:val="0"/>
+          <w:numId w:val="1041"/>
+        </w:numPr>
+        <w:pStyle w:val="Compact"/>
+        <w:ind w:left="396" w:hanging="180"/>
+      </w:pPr>
+      <w:r>
+        <w:t xml:space="preserve">a substantial amount of … 大量的……</w:t>
       </w:r>
     </w:p>
     <w:p>
@@ -19842,7 +20220,7 @@
         <w:pStyle w:val="BlockText"/>
       </w:pPr>
       <w:r>
-        <w:t xml:space="preserve">✗ Thanks to the earthquake, thousands died.（❌ 语气完全错误）</w:t>
+        <w:t xml:space="preserve">✗ Thanks to the earthquake, thousands died.（✗ 语气完全错误）</w:t>
       </w:r>
       <w:r>
         <w:t xml:space="preserve"> </w:t>
@@ -20153,7 +20531,7 @@
       <w:pPr>
         <w:numPr>
           <w:ilvl w:val="0"/>
-          <w:numId w:val="1022"/>
+          <w:numId w:val="1042"/>
         </w:numPr>
         <w:pStyle w:val="Compact"/>
         <w:ind w:left="396" w:hanging="180"/>
@@ -20177,7 +20555,7 @@
       <w:pPr>
         <w:numPr>
           <w:ilvl w:val="0"/>
-          <w:numId w:val="1022"/>
+          <w:numId w:val="1042"/>
         </w:numPr>
         <w:pStyle w:val="Compact"/>
         <w:ind w:left="396" w:hanging="180"/>
@@ -20473,7 +20851,7 @@
       <w:pPr>
         <w:numPr>
           <w:ilvl w:val="0"/>
-          <w:numId w:val="1023"/>
+          <w:numId w:val="1043"/>
         </w:numPr>
         <w:pStyle w:val="Compact"/>
         <w:ind w:left="396" w:hanging="180"/>
@@ -20495,7 +20873,7 @@
       <w:pPr>
         <w:numPr>
           <w:ilvl w:val="0"/>
-          <w:numId w:val="1023"/>
+          <w:numId w:val="1043"/>
         </w:numPr>
         <w:pStyle w:val="Compact"/>
         <w:ind w:left="396" w:hanging="180"/>
@@ -20559,23 +20937,44 @@
       <w:r>
         <w:t xml:space="preserve">常见搭配：</w:t>
       </w:r>
-      <w:r>
-        <w:t xml:space="preserve"> </w:t>
-      </w:r>
-      <w:r>
-        <w:t xml:space="preserve">- transform the way … 彻底改变……的方式</w:t>
-      </w:r>
-      <w:r>
-        <w:t xml:space="preserve"> </w:t>
-      </w:r>
-      <w:r>
-        <w:t xml:space="preserve">- transform … into … 把……变成……</w:t>
-      </w:r>
-      <w:r>
-        <w:t xml:space="preserve"> </w:t>
-      </w:r>
-      <w:r>
-        <w:t xml:space="preserve">- a transforming / transformative experience 一次改变人生的经历</w:t>
+    </w:p>
+    <w:p>
+      <w:pPr>
+        <w:numPr>
+          <w:ilvl w:val="0"/>
+          <w:numId w:val="1044"/>
+        </w:numPr>
+        <w:pStyle w:val="Compact"/>
+        <w:ind w:left="396" w:hanging="180"/>
+      </w:pPr>
+      <w:r>
+        <w:t xml:space="preserve">transform the way … 彻底改变……的方式</w:t>
+      </w:r>
+    </w:p>
+    <w:p>
+      <w:pPr>
+        <w:numPr>
+          <w:ilvl w:val="0"/>
+          <w:numId w:val="1044"/>
+        </w:numPr>
+        <w:pStyle w:val="Compact"/>
+        <w:ind w:left="396" w:hanging="180"/>
+      </w:pPr>
+      <w:r>
+        <w:t xml:space="preserve">transform … into … 把……变成……</w:t>
+      </w:r>
+    </w:p>
+    <w:p>
+      <w:pPr>
+        <w:numPr>
+          <w:ilvl w:val="0"/>
+          <w:numId w:val="1044"/>
+        </w:numPr>
+        <w:pStyle w:val="Compact"/>
+        <w:ind w:left="396" w:hanging="180"/>
+      </w:pPr>
+      <w:r>
+        <w:t xml:space="preserve">a transforming / transformative experience 一次改变人生的经历</w:t>
       </w:r>
     </w:p>
     <w:p>
@@ -20806,23 +21205,44 @@
       <w:r>
         <w:t xml:space="preserve">相关词：</w:t>
       </w:r>
-      <w:r>
-        <w:t xml:space="preserve"> </w:t>
-      </w:r>
-      <w:r>
-        <w:t xml:space="preserve">- epidemic n. 流行病；adj. 流行性的</w:t>
-      </w:r>
-      <w:r>
-        <w:t xml:space="preserve"> </w:t>
-      </w:r>
-      <w:r>
-        <w:t xml:space="preserve">- pandemic n. 大流行病（全球性）</w:t>
-      </w:r>
-      <w:r>
-        <w:t xml:space="preserve"> </w:t>
-      </w:r>
-      <w:r>
-        <w:t xml:space="preserve">- endemic adj. 地方性的</w:t>
+    </w:p>
+    <w:p>
+      <w:pPr>
+        <w:numPr>
+          <w:ilvl w:val="0"/>
+          <w:numId w:val="1045"/>
+        </w:numPr>
+        <w:pStyle w:val="Compact"/>
+        <w:ind w:left="396" w:hanging="180"/>
+      </w:pPr>
+      <w:r>
+        <w:t xml:space="preserve">epidemic n. 流行病；adj. 流行性的</w:t>
+      </w:r>
+    </w:p>
+    <w:p>
+      <w:pPr>
+        <w:numPr>
+          <w:ilvl w:val="0"/>
+          <w:numId w:val="1045"/>
+        </w:numPr>
+        <w:pStyle w:val="Compact"/>
+        <w:ind w:left="396" w:hanging="180"/>
+      </w:pPr>
+      <w:r>
+        <w:t xml:space="preserve">pandemic n. 大流行病（全球性）</w:t>
+      </w:r>
+    </w:p>
+    <w:p>
+      <w:pPr>
+        <w:numPr>
+          <w:ilvl w:val="0"/>
+          <w:numId w:val="1045"/>
+        </w:numPr>
+        <w:pStyle w:val="Compact"/>
+        <w:ind w:left="396" w:hanging="180"/>
+      </w:pPr>
+      <w:r>
+        <w:t xml:space="preserve">endemic adj. 地方性的</w:t>
       </w:r>
     </w:p>
     <w:p>
@@ -21178,17 +21598,18 @@
           <w:b/>
           <w:color w:val="1E293B"/>
         </w:rPr>
-        <w:t xml:space="preserve">🎓 可迁移句型：</w:t>
-      </w:r>
-      <w:r>
-        <w:t xml:space="preserve"> </w:t>
-      </w:r>
-      <w:r>
-        <w:t xml:space="preserve">-</w:t>
-      </w:r>
-      <w:r>
-        <w:t xml:space="preserve"> </w:t>
-      </w:r>
+        <w:t xml:space="preserve">※ 可迁移句型：</w:t>
+      </w:r>
+    </w:p>
+    <w:p>
+      <w:pPr>
+        <w:numPr>
+          <w:ilvl w:val="0"/>
+          <w:numId w:val="1046"/>
+        </w:numPr>
+        <w:pStyle w:val="Compact"/>
+        <w:ind w:left="396" w:hanging="180"/>
+      </w:pPr>
       <w:r>
         <w:rPr>
           <w:i/>
@@ -21222,15 +21643,16 @@
         </w:rPr>
         <w:t xml:space="preserve">people communicate.</w:t>
       </w:r>
-      <w:r>
-        <w:t xml:space="preserve"> </w:t>
-      </w:r>
-      <w:r>
-        <w:t xml:space="preserve">-</w:t>
-      </w:r>
-      <w:r>
-        <w:t xml:space="preserve"> </w:t>
-      </w:r>
+    </w:p>
+    <w:p>
+      <w:pPr>
+        <w:numPr>
+          <w:ilvl w:val="0"/>
+          <w:numId w:val="1046"/>
+        </w:numPr>
+        <w:pStyle w:val="Compact"/>
+        <w:ind w:left="396" w:hanging="180"/>
+      </w:pPr>
       <w:r>
         <w:rPr>
           <w:i/>
@@ -23773,7 +24195,7 @@
       <w:pPr>
         <w:numPr>
           <w:ilvl w:val="0"/>
-          <w:numId w:val="1024"/>
+          <w:numId w:val="1047"/>
         </w:numPr>
         <w:pStyle w:val="Compact"/>
         <w:ind w:left="396" w:hanging="180"/>
@@ -23797,7 +24219,7 @@
       <w:pPr>
         <w:numPr>
           <w:ilvl w:val="0"/>
-          <w:numId w:val="1024"/>
+          <w:numId w:val="1047"/>
         </w:numPr>
         <w:pStyle w:val="Compact"/>
         <w:ind w:left="396" w:hanging="180"/>
@@ -23821,7 +24243,7 @@
       <w:pPr>
         <w:numPr>
           <w:ilvl w:val="0"/>
-          <w:numId w:val="1024"/>
+          <w:numId w:val="1047"/>
         </w:numPr>
         <w:pStyle w:val="Compact"/>
         <w:ind w:left="396" w:hanging="180"/>
@@ -23835,14 +24257,14 @@
         <w:t xml:space="preserve">The reason is that …</w:t>
       </w:r>
       <w:r>
-        <w:t xml:space="preserve">（❌ 不能用 because）原因是……</w:t>
+        <w:t xml:space="preserve">（✗ 不能用 because）原因是……</w:t>
       </w:r>
     </w:p>
     <w:p>
       <w:pPr>
         <w:numPr>
           <w:ilvl w:val="0"/>
-          <w:numId w:val="1024"/>
+          <w:numId w:val="1047"/>
         </w:numPr>
         <w:pStyle w:val="Compact"/>
         <w:ind w:left="396" w:hanging="180"/>
@@ -23866,7 +24288,7 @@
       <w:pPr>
         <w:numPr>
           <w:ilvl w:val="0"/>
-          <w:numId w:val="1024"/>
+          <w:numId w:val="1047"/>
         </w:numPr>
         <w:pStyle w:val="Compact"/>
         <w:ind w:left="396" w:hanging="180"/>
@@ -23890,7 +24312,7 @@
       <w:pPr>
         <w:numPr>
           <w:ilvl w:val="0"/>
-          <w:numId w:val="1024"/>
+          <w:numId w:val="1047"/>
         </w:numPr>
         <w:pStyle w:val="Compact"/>
         <w:ind w:left="396" w:hanging="180"/>
@@ -23914,7 +24336,7 @@
       <w:pPr>
         <w:numPr>
           <w:ilvl w:val="0"/>
-          <w:numId w:val="1024"/>
+          <w:numId w:val="1047"/>
         </w:numPr>
         <w:pStyle w:val="Compact"/>
         <w:ind w:left="396" w:hanging="180"/>
@@ -24197,7 +24619,7 @@
       <w:pPr>
         <w:numPr>
           <w:ilvl w:val="0"/>
-          <w:numId w:val="1025"/>
+          <w:numId w:val="1048"/>
         </w:numPr>
         <w:pStyle w:val="Compact"/>
         <w:ind w:left="396" w:hanging="180"/>
@@ -24218,7 +24640,7 @@
       <w:pPr>
         <w:numPr>
           <w:ilvl w:val="0"/>
-          <w:numId w:val="1025"/>
+          <w:numId w:val="1048"/>
         </w:numPr>
         <w:pStyle w:val="Compact"/>
         <w:ind w:left="396" w:hanging="180"/>
@@ -24239,7 +24661,7 @@
       <w:pPr>
         <w:numPr>
           <w:ilvl w:val="0"/>
-          <w:numId w:val="1025"/>
+          <w:numId w:val="1048"/>
         </w:numPr>
         <w:pStyle w:val="Compact"/>
         <w:ind w:left="396" w:hanging="180"/>
@@ -24295,7 +24717,7 @@
       <w:pPr>
         <w:numPr>
           <w:ilvl w:val="0"/>
-          <w:numId w:val="1025"/>
+          <w:numId w:val="1048"/>
         </w:numPr>
         <w:pStyle w:val="Compact"/>
         <w:ind w:left="396" w:hanging="180"/>
@@ -24426,7 +24848,7 @@
       <w:pPr>
         <w:numPr>
           <w:ilvl w:val="0"/>
-          <w:numId w:val="1025"/>
+          <w:numId w:val="1048"/>
         </w:numPr>
         <w:pStyle w:val="Compact"/>
         <w:ind w:left="396" w:hanging="180"/>
@@ -24483,7 +24905,7 @@
       <w:pPr>
         <w:numPr>
           <w:ilvl w:val="0"/>
-          <w:numId w:val="1025"/>
+          <w:numId w:val="1048"/>
         </w:numPr>
         <w:pStyle w:val="Compact"/>
         <w:ind w:left="396" w:hanging="180"/>
@@ -25049,7 +25471,34 @@
     <w:abstractNumId w:val="991"/>
   </w:num>
   <w:num w:numId="1017">
-    <w:abstractNumId w:val="991"/>
+    <w:abstractNumId w:val="99411"/>
+    <w:lvlOverride w:ilvl="0">
+      <w:startOverride w:val="1"/>
+    </w:lvlOverride>
+    <w:lvlOverride w:ilvl="1">
+      <w:startOverride w:val="1"/>
+    </w:lvlOverride>
+    <w:lvlOverride w:ilvl="2">
+      <w:startOverride w:val="1"/>
+    </w:lvlOverride>
+    <w:lvlOverride w:ilvl="3">
+      <w:startOverride w:val="1"/>
+    </w:lvlOverride>
+    <w:lvlOverride w:ilvl="4">
+      <w:startOverride w:val="1"/>
+    </w:lvlOverride>
+    <w:lvlOverride w:ilvl="5">
+      <w:startOverride w:val="1"/>
+    </w:lvlOverride>
+    <w:lvlOverride w:ilvl="6">
+      <w:startOverride w:val="1"/>
+    </w:lvlOverride>
+    <w:lvlOverride w:ilvl="7">
+      <w:startOverride w:val="1"/>
+    </w:lvlOverride>
+    <w:lvlOverride w:ilvl="8">
+      <w:startOverride w:val="1"/>
+    </w:lvlOverride>
   </w:num>
   <w:num w:numId="1018">
     <w:abstractNumId w:val="991"/>
@@ -25073,6 +25522,75 @@
     <w:abstractNumId w:val="991"/>
   </w:num>
   <w:num w:numId="1025">
+    <w:abstractNumId w:val="991"/>
+  </w:num>
+  <w:num w:numId="1026">
+    <w:abstractNumId w:val="991"/>
+  </w:num>
+  <w:num w:numId="1027">
+    <w:abstractNumId w:val="991"/>
+  </w:num>
+  <w:num w:numId="1028">
+    <w:abstractNumId w:val="991"/>
+  </w:num>
+  <w:num w:numId="1029">
+    <w:abstractNumId w:val="991"/>
+  </w:num>
+  <w:num w:numId="1030">
+    <w:abstractNumId w:val="991"/>
+  </w:num>
+  <w:num w:numId="1031">
+    <w:abstractNumId w:val="991"/>
+  </w:num>
+  <w:num w:numId="1032">
+    <w:abstractNumId w:val="991"/>
+  </w:num>
+  <w:num w:numId="1033">
+    <w:abstractNumId w:val="991"/>
+  </w:num>
+  <w:num w:numId="1034">
+    <w:abstractNumId w:val="991"/>
+  </w:num>
+  <w:num w:numId="1035">
+    <w:abstractNumId w:val="991"/>
+  </w:num>
+  <w:num w:numId="1036">
+    <w:abstractNumId w:val="991"/>
+  </w:num>
+  <w:num w:numId="1037">
+    <w:abstractNumId w:val="991"/>
+  </w:num>
+  <w:num w:numId="1038">
+    <w:abstractNumId w:val="991"/>
+  </w:num>
+  <w:num w:numId="1039">
+    <w:abstractNumId w:val="991"/>
+  </w:num>
+  <w:num w:numId="1040">
+    <w:abstractNumId w:val="991"/>
+  </w:num>
+  <w:num w:numId="1041">
+    <w:abstractNumId w:val="991"/>
+  </w:num>
+  <w:num w:numId="1042">
+    <w:abstractNumId w:val="991"/>
+  </w:num>
+  <w:num w:numId="1043">
+    <w:abstractNumId w:val="991"/>
+  </w:num>
+  <w:num w:numId="1044">
+    <w:abstractNumId w:val="991"/>
+  </w:num>
+  <w:num w:numId="1045">
+    <w:abstractNumId w:val="991"/>
+  </w:num>
+  <w:num w:numId="1046">
+    <w:abstractNumId w:val="991"/>
+  </w:num>
+  <w:num w:numId="1047">
+    <w:abstractNumId w:val="991"/>
+  </w:num>
+  <w:num w:numId="1048">
     <w:abstractNumId w:val="99411"/>
     <w:lvlOverride w:ilvl="0">
       <w:startOverride w:val="1"/>

</xml_diff>